<commit_message>
Restyle سند ۵۰ to match Faraz11_Styled-2: plain questions, each question on a new page, no website in footer
Co-Authored-By: Claude Opus 5.5 <noreply@anthropic.com>
Claude-Session: https://claude.ai/code/session_01TrXymqLHvvGkj4BjBtBvz9
</commit_message>
<xml_diff>
--- a/output/Sanad50_Styled.docx
+++ b/output/Sanad50_Styled.docx
@@ -6,13 +6,7 @@
       <w:pPr>
         <w:keepNext/>
         <w:keepLines/>
-        <w:pBdr>
-          <w:top w:val="single" w:sz="7" w:space="8" w:color="F0C45F"/>
-          <w:right w:val="single" w:sz="7" w:space="8" w:color="F0C45F"/>
-          <w:left w:val="single" w:sz="7" w:space="8" w:color="F0C45F"/>
-        </w:pBdr>
-        <w:shd w:val="clear" w:color="auto" w:fill="FFF8E7"/>
-        <w:spacing w:line="280" w:lineRule="auto" w:before="80" w:after="80"/>
+        <w:spacing w:line="223" w:lineRule="auto"/>
         <w:ind w:left="567" w:hanging="567"/>
         <w:jc w:val="both"/>
       </w:pPr>
@@ -21,7 +15,6 @@
           <w:rFonts w:hint="cs"/>
           <w:b/>
           <w:bCs/>
-          <w:color w:val="282360"/>
           <w:rtl/>
         </w:rPr>
         <w:t>۲</w:t>
@@ -30,7 +23,6 @@
         <w:rPr>
           <w:b/>
           <w:bCs/>
-          <w:color w:val="282360"/>
           <w:rtl/>
         </w:rPr>
         <w:t>۱-</w:t>
@@ -39,7 +31,6 @@
         <w:rPr>
           <w:b/>
           <w:bCs/>
-          <w:color w:val="282360"/>
           <w:rtl/>
         </w:rPr>
         <w:tab/>
@@ -50,7 +41,6 @@
           <w:rFonts w:hint="cs"/>
           <w:b/>
           <w:bCs/>
-          <w:color w:val="282360"/>
           <w:rtl/>
         </w:rPr>
         <w:t>در ارتباط با دریاچهٔ ارومیه، درست است؟</w:t>
@@ -60,14 +50,12 @@
       <w:pPr>
         <w:keepNext/>
         <w:keepLines/>
-        <w:shd w:val="clear" w:color="auto" w:fill="FFF8E7"/>
-        <w:spacing w:line="223" w:lineRule="auto" w:after="65"/>
+        <w:spacing w:line="223" w:lineRule="auto"/>
         <w:ind w:left="837" w:hanging="270"/>
         <w:jc w:val="both"/>
       </w:pPr>
       <w:r>
         <w:rPr>
-          <w:color w:val="282360"/>
           <w:sz w:val="26"/>
           <w:szCs w:val="26"/>
           <w:rtl/>
@@ -76,7 +64,6 @@
       </w:r>
       <w:r>
         <w:rPr>
-          <w:color w:val="282360"/>
           <w:sz w:val="26"/>
           <w:szCs w:val="26"/>
           <w:rtl/>
@@ -89,14 +76,12 @@
       <w:pPr>
         <w:keepNext/>
         <w:keepLines/>
-        <w:shd w:val="clear" w:color="auto" w:fill="FFF8E7"/>
-        <w:spacing w:line="223" w:lineRule="auto" w:after="65"/>
+        <w:spacing w:line="223" w:lineRule="auto"/>
         <w:ind w:left="837" w:hanging="270"/>
         <w:jc w:val="both"/>
       </w:pPr>
       <w:r>
         <w:rPr>
-          <w:color w:val="282360"/>
           <w:sz w:val="26"/>
           <w:szCs w:val="26"/>
           <w:rtl/>
@@ -105,7 +90,6 @@
       </w:r>
       <w:r>
         <w:rPr>
-          <w:color w:val="282360"/>
           <w:sz w:val="26"/>
           <w:szCs w:val="26"/>
           <w:rtl/>
@@ -118,14 +102,12 @@
       <w:pPr>
         <w:keepNext/>
         <w:keepLines/>
-        <w:shd w:val="clear" w:color="auto" w:fill="FFF8E7"/>
-        <w:spacing w:line="223" w:lineRule="auto" w:after="65"/>
+        <w:spacing w:line="223" w:lineRule="auto"/>
         <w:ind w:left="837" w:hanging="270"/>
         <w:jc w:val="both"/>
       </w:pPr>
       <w:r>
         <w:rPr>
-          <w:color w:val="282360"/>
           <w:sz w:val="26"/>
           <w:szCs w:val="26"/>
           <w:rtl/>
@@ -134,7 +116,6 @@
       </w:r>
       <w:r>
         <w:rPr>
-          <w:color w:val="282360"/>
           <w:sz w:val="26"/>
           <w:szCs w:val="26"/>
           <w:rtl/>
@@ -147,14 +128,12 @@
       <w:pPr>
         <w:keepNext/>
         <w:keepLines/>
-        <w:shd w:val="clear" w:color="auto" w:fill="FFF8E7"/>
-        <w:spacing w:line="223" w:lineRule="auto" w:after="65"/>
+        <w:spacing w:line="223" w:lineRule="auto"/>
         <w:ind w:left="837" w:hanging="270"/>
         <w:jc w:val="both"/>
       </w:pPr>
       <w:r>
         <w:rPr>
-          <w:color w:val="282360"/>
           <w:sz w:val="26"/>
           <w:szCs w:val="26"/>
           <w:rtl/>
@@ -163,7 +142,6 @@
       </w:r>
       <w:r>
         <w:rPr>
-          <w:color w:val="282360"/>
           <w:sz w:val="26"/>
           <w:szCs w:val="26"/>
           <w:rtl/>
@@ -174,7 +152,6 @@
       <w:r>
         <w:rPr>
           <w:rFonts w:hint="cs"/>
-          <w:color w:val="282360"/>
           <w:sz w:val="26"/>
           <w:szCs w:val="26"/>
           <w:rtl/>
@@ -183,7 +160,6 @@
       </w:r>
       <w:r>
         <w:rPr>
-          <w:color w:val="282360"/>
           <w:sz w:val="26"/>
           <w:szCs w:val="26"/>
           <w:rtl/>
@@ -2067,13 +2043,8 @@
       <w:pPr>
         <w:keepNext/>
         <w:keepLines/>
-        <w:pBdr>
-          <w:top w:val="single" w:sz="7" w:space="8" w:color="F0C45F"/>
-          <w:right w:val="single" w:sz="7" w:space="8" w:color="F0C45F"/>
-          <w:left w:val="single" w:sz="7" w:space="8" w:color="F0C45F"/>
-        </w:pBdr>
-        <w:shd w:val="clear" w:color="auto" w:fill="FFF8E7"/>
-        <w:spacing w:line="280" w:lineRule="auto" w:before="80" w:after="80"/>
+        <w:pageBreakBefore/>
+        <w:spacing w:line="223" w:lineRule="auto"/>
         <w:ind w:left="567" w:hanging="567"/>
         <w:jc w:val="both"/>
       </w:pPr>
@@ -2081,7 +2052,6 @@
         <w:rPr>
           <w:b/>
           <w:bCs/>
-          <w:color w:val="282360"/>
           <w:rtl/>
         </w:rPr>
         <w:lastRenderedPageBreak/>
@@ -2091,7 +2061,6 @@
         <w:rPr>
           <w:b/>
           <w:bCs/>
-          <w:color w:val="282360"/>
           <w:rtl/>
         </w:rPr>
         <w:tab/>
@@ -2102,7 +2071,6 @@
           <w:rFonts w:hint="cs"/>
           <w:b/>
           <w:bCs/>
-          <w:color w:val="282360"/>
           <w:rtl/>
         </w:rPr>
         <w:t>برای تکمیل عبارت زیر مناسب است؟</w:t>
@@ -2112,8 +2080,7 @@
       <w:pPr>
         <w:keepNext/>
         <w:keepLines/>
-        <w:shd w:val="clear" w:color="auto" w:fill="FFF8E7"/>
-        <w:spacing w:line="223" w:lineRule="auto" w:after="65"/>
+        <w:spacing w:line="223" w:lineRule="auto"/>
         <w:ind w:left="567"/>
         <w:jc w:val="both"/>
       </w:pPr>
@@ -2121,7 +2088,6 @@
         <w:rPr>
           <w:b/>
           <w:bCs/>
-          <w:color w:val="282360"/>
           <w:rtl/>
         </w:rPr>
         <w:t>«در سطوح سازمان‌یابی حیات</w:t>
@@ -2131,7 +2097,6 @@
           <w:rFonts w:hint="cs"/>
           <w:b/>
           <w:bCs/>
-          <w:color w:val="282360"/>
           <w:rtl/>
         </w:rPr>
         <w:t>،</w:t>
@@ -2140,7 +2105,6 @@
         <w:rPr>
           <w:b/>
           <w:bCs/>
-          <w:color w:val="282360"/>
           <w:rtl/>
         </w:rPr>
         <w:t xml:space="preserve"> سطحی که برای اولین</w:t>
@@ -2150,7 +2114,6 @@
           <w:rFonts w:hint="cs"/>
           <w:b/>
           <w:bCs/>
-          <w:color w:val="282360"/>
           <w:rtl/>
         </w:rPr>
         <w:t xml:space="preserve"> </w:t>
@@ -2159,7 +2122,6 @@
         <w:rPr>
           <w:b/>
           <w:bCs/>
-          <w:color w:val="282360"/>
           <w:rtl/>
         </w:rPr>
         <w:t>بار .................. در آن مشاهده می‌شود</w:t>
@@ -2169,7 +2131,6 @@
           <w:rFonts w:hint="cs"/>
           <w:b/>
           <w:bCs/>
-          <w:color w:val="282360"/>
           <w:rtl/>
         </w:rPr>
         <w:t>،</w:t>
@@ -2178,7 +2139,6 @@
         <w:rPr>
           <w:b/>
           <w:bCs/>
-          <w:color w:val="282360"/>
           <w:rtl/>
         </w:rPr>
         <w:t xml:space="preserve"> ................... .»</w:t>
@@ -2188,14 +2148,12 @@
       <w:pPr>
         <w:keepNext/>
         <w:keepLines/>
-        <w:shd w:val="clear" w:color="auto" w:fill="FFF8E7"/>
-        <w:spacing w:line="223" w:lineRule="auto" w:after="65"/>
+        <w:spacing w:line="223" w:lineRule="auto"/>
         <w:ind w:left="837" w:hanging="270"/>
         <w:jc w:val="both"/>
       </w:pPr>
       <w:r>
         <w:rPr>
-          <w:color w:val="282360"/>
           <w:sz w:val="26"/>
           <w:szCs w:val="26"/>
           <w:rtl/>
@@ -2204,7 +2162,6 @@
       </w:r>
       <w:r>
         <w:rPr>
-          <w:color w:val="282360"/>
           <w:sz w:val="26"/>
           <w:szCs w:val="26"/>
           <w:rtl/>
@@ -2215,7 +2172,6 @@
       <w:r>
         <w:rPr>
           <w:rFonts w:hint="cs"/>
-          <w:color w:val="282360"/>
           <w:sz w:val="26"/>
           <w:szCs w:val="26"/>
           <w:rtl/>
@@ -2224,7 +2180,6 @@
       </w:r>
       <w:r>
         <w:rPr>
-          <w:color w:val="282360"/>
           <w:sz w:val="26"/>
           <w:szCs w:val="26"/>
           <w:rtl/>
@@ -2234,7 +2189,6 @@
       <w:r>
         <w:rPr>
           <w:rFonts w:hint="cs"/>
-          <w:color w:val="282360"/>
           <w:sz w:val="26"/>
           <w:szCs w:val="26"/>
           <w:rtl/>
@@ -2243,7 +2197,6 @@
       </w:r>
       <w:r>
         <w:rPr>
-          <w:color w:val="282360"/>
           <w:sz w:val="26"/>
           <w:szCs w:val="26"/>
           <w:rtl/>
@@ -2255,14 +2208,12 @@
       <w:pPr>
         <w:keepNext/>
         <w:keepLines/>
-        <w:shd w:val="clear" w:color="auto" w:fill="FFF8E7"/>
-        <w:spacing w:line="223" w:lineRule="auto" w:after="65"/>
+        <w:spacing w:line="223" w:lineRule="auto"/>
         <w:ind w:left="837" w:hanging="270"/>
         <w:jc w:val="both"/>
       </w:pPr>
       <w:r>
         <w:rPr>
-          <w:color w:val="282360"/>
           <w:sz w:val="26"/>
           <w:szCs w:val="26"/>
           <w:rtl/>
@@ -2271,7 +2222,6 @@
       </w:r>
       <w:r>
         <w:rPr>
-          <w:color w:val="282360"/>
           <w:sz w:val="26"/>
           <w:szCs w:val="26"/>
           <w:rtl/>
@@ -2282,7 +2232,6 @@
       <w:r>
         <w:rPr>
           <w:rFonts w:hint="cs"/>
-          <w:color w:val="282360"/>
           <w:sz w:val="26"/>
           <w:szCs w:val="26"/>
           <w:rtl/>
@@ -2291,7 +2240,6 @@
       </w:r>
       <w:r>
         <w:rPr>
-          <w:color w:val="282360"/>
           <w:sz w:val="26"/>
           <w:szCs w:val="26"/>
           <w:rtl/>
@@ -2301,7 +2249,6 @@
       <w:r>
         <w:rPr>
           <w:rFonts w:hint="cs"/>
-          <w:color w:val="282360"/>
           <w:sz w:val="26"/>
           <w:szCs w:val="26"/>
           <w:rtl/>
@@ -2310,7 +2257,6 @@
       </w:r>
       <w:r>
         <w:rPr>
-          <w:color w:val="282360"/>
           <w:sz w:val="26"/>
           <w:szCs w:val="26"/>
           <w:rtl/>
@@ -2320,7 +2266,6 @@
       <w:r>
         <w:rPr>
           <w:rFonts w:hint="cs"/>
-          <w:color w:val="282360"/>
           <w:sz w:val="26"/>
           <w:szCs w:val="26"/>
           <w:rtl/>
@@ -2329,7 +2274,6 @@
       </w:r>
       <w:r>
         <w:rPr>
-          <w:color w:val="282360"/>
           <w:sz w:val="26"/>
           <w:szCs w:val="26"/>
           <w:rtl/>
@@ -2341,14 +2285,12 @@
       <w:pPr>
         <w:keepNext/>
         <w:keepLines/>
-        <w:shd w:val="clear" w:color="auto" w:fill="FFF8E7"/>
-        <w:spacing w:line="223" w:lineRule="auto" w:after="65"/>
+        <w:spacing w:line="223" w:lineRule="auto"/>
         <w:ind w:left="837" w:hanging="270"/>
         <w:jc w:val="both"/>
       </w:pPr>
       <w:r>
         <w:rPr>
-          <w:color w:val="282360"/>
           <w:sz w:val="26"/>
           <w:szCs w:val="26"/>
           <w:rtl/>
@@ -2357,7 +2299,6 @@
       </w:r>
       <w:r>
         <w:rPr>
-          <w:color w:val="282360"/>
           <w:sz w:val="26"/>
           <w:szCs w:val="26"/>
           <w:rtl/>
@@ -2368,7 +2309,6 @@
       <w:r>
         <w:rPr>
           <w:rFonts w:hint="cs"/>
-          <w:color w:val="282360"/>
           <w:sz w:val="26"/>
           <w:szCs w:val="26"/>
           <w:rtl/>
@@ -2377,7 +2317,6 @@
       </w:r>
       <w:r>
         <w:rPr>
-          <w:color w:val="282360"/>
           <w:sz w:val="26"/>
           <w:szCs w:val="26"/>
           <w:rtl/>
@@ -2387,10 +2326,8 @@
     </w:p>
     <w:p>
       <w:pPr>
-        <w:keepNext/>
         <w:keepLines/>
-        <w:shd w:val="clear" w:color="auto" w:fill="FFF8E7"/>
-        <w:spacing w:line="223" w:lineRule="auto" w:after="65"/>
+        <w:spacing w:line="223" w:lineRule="auto"/>
         <w:ind w:left="837" w:hanging="270"/>
         <w:jc w:val="both"/>
         <w:rPr>
@@ -2399,7 +2336,6 @@
       </w:pPr>
       <w:r>
         <w:rPr>
-          <w:color w:val="282360"/>
           <w:sz w:val="26"/>
           <w:szCs w:val="26"/>
           <w:rtl/>
@@ -2408,7 +2344,6 @@
       </w:r>
       <w:r>
         <w:rPr>
-          <w:color w:val="282360"/>
           <w:sz w:val="26"/>
           <w:szCs w:val="26"/>
           <w:rtl/>
@@ -2419,7 +2354,6 @@
       <w:r>
         <w:rPr>
           <w:rFonts w:hint="cs"/>
-          <w:color w:val="282360"/>
           <w:sz w:val="26"/>
           <w:szCs w:val="26"/>
           <w:rtl/>
@@ -2428,7 +2362,6 @@
       </w:r>
       <w:r>
         <w:rPr>
-          <w:color w:val="282360"/>
           <w:sz w:val="26"/>
           <w:szCs w:val="26"/>
           <w:rtl/>
@@ -5195,13 +5128,8 @@
       <w:pPr>
         <w:keepNext/>
         <w:keepLines/>
-        <w:pBdr>
-          <w:top w:val="single" w:sz="7" w:space="8" w:color="F0C45F"/>
-          <w:right w:val="single" w:sz="7" w:space="8" w:color="F0C45F"/>
-          <w:left w:val="single" w:sz="7" w:space="8" w:color="F0C45F"/>
-        </w:pBdr>
-        <w:shd w:val="clear" w:color="auto" w:fill="FFF8E7"/>
-        <w:spacing w:line="280" w:lineRule="auto" w:before="80" w:after="80"/>
+        <w:pageBreakBefore/>
+        <w:spacing w:line="223" w:lineRule="auto"/>
         <w:ind w:left="567" w:hanging="567"/>
         <w:jc w:val="both"/>
         <w:rPr>
@@ -5212,7 +5140,6 @@
         <w:rPr>
           <w:b/>
           <w:bCs/>
-          <w:color w:val="282360"/>
           <w:rtl/>
         </w:rPr>
         <w:lastRenderedPageBreak/>
@@ -5222,7 +5149,6 @@
         <w:rPr>
           <w:b/>
           <w:bCs/>
-          <w:color w:val="282360"/>
           <w:rtl/>
         </w:rPr>
         <w:tab/>
@@ -5232,7 +5158,6 @@
           <w:rFonts w:hint="cs"/>
           <w:b/>
           <w:bCs/>
-          <w:color w:val="282360"/>
           <w:rtl/>
         </w:rPr>
         <w:t xml:space="preserve">با </w:t>
@@ -5241,7 +5166,6 @@
         <w:rPr>
           <w:b/>
           <w:bCs/>
-          <w:color w:val="282360"/>
           <w:rtl/>
         </w:rPr>
         <w:t xml:space="preserve">توجه به مطالب کتاب درسی، چند مورد </w:t>
@@ -5251,7 +5175,6 @@
           <w:rFonts w:hint="cs"/>
           <w:b/>
           <w:bCs/>
-          <w:color w:val="282360"/>
           <w:rtl/>
         </w:rPr>
         <w:t>برای تکمیل عبارت زیر مناسب است</w:t>
@@ -5261,7 +5184,6 @@
           <w:rFonts w:cs="Calibri" w:hint="cs"/>
           <w:b/>
           <w:bCs/>
-          <w:color w:val="282360"/>
           <w:rtl/>
         </w:rPr>
         <w:t>؟</w:t>
@@ -5271,8 +5193,7 @@
       <w:pPr>
         <w:keepNext/>
         <w:keepLines/>
-        <w:shd w:val="clear" w:color="auto" w:fill="FFF8E7"/>
-        <w:spacing w:line="223" w:lineRule="auto" w:after="65"/>
+        <w:spacing w:line="223" w:lineRule="auto"/>
         <w:ind w:left="567"/>
         <w:jc w:val="both"/>
       </w:pPr>
@@ -5280,7 +5201,6 @@
         <w:rPr>
           <w:b/>
           <w:bCs/>
-          <w:color w:val="282360"/>
           <w:rtl/>
         </w:rPr>
         <w:t>«در هر روش عبور مواد از عرض غشای یاخته که ...................»</w:t>
@@ -5290,8 +5210,7 @@
       <w:pPr>
         <w:keepNext/>
         <w:keepLines/>
-        <w:shd w:val="clear" w:color="auto" w:fill="FFF8E7"/>
-        <w:spacing w:line="223" w:lineRule="auto" w:after="65"/>
+        <w:spacing w:line="223" w:lineRule="auto"/>
         <w:ind w:left="567"/>
         <w:jc w:val="both"/>
       </w:pPr>
@@ -5299,7 +5218,6 @@
         <w:rPr>
           <w:b/>
           <w:bCs/>
-          <w:color w:val="282360"/>
           <w:rtl/>
         </w:rPr>
         <w:t>الف: بعضی از یاخته‌ها ذرات بزرگ را از طریق آن جابه‌جا می</w:t>
@@ -5309,7 +5227,6 @@
           <w:rFonts w:hint="cs"/>
           <w:b/>
           <w:bCs/>
-          <w:color w:val="282360"/>
           <w:rtl/>
         </w:rPr>
         <w:t>‌</w:t>
@@ -5318,7 +5235,6 @@
         <w:rPr>
           <w:b/>
           <w:bCs/>
-          <w:color w:val="282360"/>
           <w:rtl/>
         </w:rPr>
         <w:t>کنند، با تشکیل ریزکیسه همراه است.</w:t>
@@ -5328,8 +5244,7 @@
       <w:pPr>
         <w:keepNext/>
         <w:keepLines/>
-        <w:shd w:val="clear" w:color="auto" w:fill="FFF8E7"/>
-        <w:spacing w:line="223" w:lineRule="auto" w:after="65"/>
+        <w:spacing w:line="223" w:lineRule="auto"/>
         <w:ind w:left="567"/>
         <w:jc w:val="both"/>
       </w:pPr>
@@ -5337,7 +5252,6 @@
         <w:rPr>
           <w:b/>
           <w:bCs/>
-          <w:color w:val="282360"/>
           <w:rtl/>
         </w:rPr>
         <w:t>ب: مواد در خلاف جهت شیب غلظت از غشا عبور می</w:t>
@@ -5347,7 +5261,6 @@
           <w:rFonts w:hint="cs"/>
           <w:b/>
           <w:bCs/>
-          <w:color w:val="282360"/>
           <w:rtl/>
         </w:rPr>
         <w:t>‌</w:t>
@@ -5356,7 +5269,6 @@
         <w:rPr>
           <w:b/>
           <w:bCs/>
-          <w:color w:val="282360"/>
           <w:rtl/>
         </w:rPr>
         <w:t>کنند، برخی پروتئین‌های حاضر در غشا تغییر وضعیت می‌دهند.</w:t>
@@ -5366,8 +5278,7 @@
       <w:pPr>
         <w:keepNext/>
         <w:keepLines/>
-        <w:shd w:val="clear" w:color="auto" w:fill="FFF8E7"/>
-        <w:spacing w:line="223" w:lineRule="auto" w:after="65"/>
+        <w:spacing w:line="223" w:lineRule="auto"/>
         <w:ind w:left="567"/>
         <w:jc w:val="both"/>
       </w:pPr>
@@ -5375,7 +5286,6 @@
         <w:rPr>
           <w:b/>
           <w:bCs/>
-          <w:color w:val="282360"/>
           <w:rtl/>
         </w:rPr>
         <w:t>ج: یاخته انرژی مصرف نمی‌کند، هرچه اختلاف غلظت دو سوی غشا بیشتر باشد</w:t>
@@ -5385,7 +5295,6 @@
           <w:rFonts w:hint="cs"/>
           <w:b/>
           <w:bCs/>
-          <w:color w:val="282360"/>
           <w:rtl/>
         </w:rPr>
         <w:t>،</w:t>
@@ -5394,7 +5303,6 @@
         <w:rPr>
           <w:b/>
           <w:bCs/>
-          <w:color w:val="282360"/>
           <w:rtl/>
         </w:rPr>
         <w:t xml:space="preserve"> همواره سرعت عبور مواد بیشتر خواهد بود.</w:t>
@@ -5404,8 +5312,7 @@
       <w:pPr>
         <w:keepNext/>
         <w:keepLines/>
-        <w:shd w:val="clear" w:color="auto" w:fill="FFF8E7"/>
-        <w:spacing w:line="223" w:lineRule="auto" w:after="65"/>
+        <w:spacing w:line="223" w:lineRule="auto"/>
         <w:ind w:left="567"/>
         <w:jc w:val="both"/>
       </w:pPr>
@@ -5413,7 +5320,6 @@
         <w:rPr>
           <w:b/>
           <w:bCs/>
-          <w:color w:val="282360"/>
           <w:rtl/>
         </w:rPr>
         <w:t>د: از طریق تغییر شکل پروتئین</w:t>
@@ -5423,7 +5329,6 @@
           <w:rFonts w:hint="cs"/>
           <w:b/>
           <w:bCs/>
-          <w:color w:val="282360"/>
           <w:rtl/>
         </w:rPr>
         <w:t>‌</w:t>
@@ -5432,7 +5337,6 @@
         <w:rPr>
           <w:b/>
           <w:bCs/>
-          <w:color w:val="282360"/>
           <w:rtl/>
         </w:rPr>
         <w:t xml:space="preserve">های سراسری غشا انجام می‌شوند، </w:t>
@@ -5442,7 +5346,6 @@
           <w:rFonts w:hint="cs"/>
           <w:b/>
           <w:bCs/>
-          <w:color w:val="282360"/>
           <w:rtl/>
         </w:rPr>
         <w:t>برای جابه‌جایی مواد از عرض غشای یاخته به انرژی نیاز دارد.</w:t>
@@ -5453,19 +5356,17 @@
         <w:bidiVisual/>
         <w:tblW w:w="9772" w:type="dxa"/>
         <w:tblBorders>
-          <w:top w:val="single" w:sz="4" w:space="0" w:color="F0C45F"/>
-          <w:left w:val="single" w:sz="4" w:space="0" w:color="F0C45F"/>
-          <w:bottom w:val="single" w:sz="4" w:space="0" w:color="F0C45F"/>
-          <w:right w:val="single" w:sz="4" w:space="0" w:color="F0C45F"/>
-          <w:insideH w:val="single" w:sz="4" w:space="0" w:color="F0C45F"/>
-          <w:insideV w:val="single" w:sz="4" w:space="0" w:color="F0C45F"/>
+          <w:top w:val="nil"/>
+          <w:left w:val="nil"/>
+          <w:bottom w:val="nil"/>
+          <w:right w:val="nil"/>
+          <w:insideH w:val="nil"/>
+          <w:insideV w:val="nil"/>
         </w:tblBorders>
         <w:tblLayout w:type="fixed"/>
         <w:tblCellMar>
-          <w:top w:w="85" w:type="dxa"/>
-          <w:left w:w="100" w:type="dxa"/>
-          <w:bottom w:w="85" w:type="dxa"/>
-          <w:right w:w="100" w:type="dxa"/>
+          <w:left w:w="0" w:type="dxa"/>
+          <w:right w:w="0" w:type="dxa"/>
         </w:tblCellMar>
         <w:tblLook w:val="04A0" w:firstRow="1" w:lastRow="0" w:firstColumn="1" w:lastColumn="0" w:noHBand="0" w:noVBand="1"/>
       </w:tblPr>
@@ -5482,8 +5383,6 @@
         <w:tc>
           <w:tcPr>
             <w:tcW w:w="2868" w:type="dxa"/>
-            <w:shd w:val="clear" w:color="auto" w:fill="FFF8E7"/>
-            <w:vAlign w:val="center"/>
           </w:tcPr>
           <w:p>
             <w:pPr>
@@ -5493,7 +5392,6 @@
             </w:pPr>
             <w:r>
               <w:rPr>
-                <w:color w:val="282360"/>
                 <w:sz w:val="26"/>
                 <w:szCs w:val="26"/>
                 <w:rtl/>
@@ -5505,8 +5403,6 @@
         <w:tc>
           <w:tcPr>
             <w:tcW w:w="2301" w:type="dxa"/>
-            <w:shd w:val="clear" w:color="auto" w:fill="FFF8E7"/>
-            <w:vAlign w:val="center"/>
           </w:tcPr>
           <w:p>
             <w:pPr>
@@ -5515,7 +5411,6 @@
             </w:pPr>
             <w:r>
               <w:rPr>
-                <w:color w:val="282360"/>
                 <w:sz w:val="26"/>
                 <w:szCs w:val="26"/>
                 <w:rtl/>
@@ -5527,8 +5422,6 @@
         <w:tc>
           <w:tcPr>
             <w:tcW w:w="2301" w:type="dxa"/>
-            <w:shd w:val="clear" w:color="auto" w:fill="FFF8E7"/>
-            <w:vAlign w:val="center"/>
           </w:tcPr>
           <w:p>
             <w:pPr>
@@ -5537,7 +5430,6 @@
             </w:pPr>
             <w:r>
               <w:rPr>
-                <w:color w:val="282360"/>
                 <w:sz w:val="26"/>
                 <w:szCs w:val="26"/>
                 <w:rtl/>
@@ -5549,8 +5441,6 @@
         <w:tc>
           <w:tcPr>
             <w:tcW w:w="2302" w:type="dxa"/>
-            <w:shd w:val="clear" w:color="auto" w:fill="FFF8E7"/>
-            <w:vAlign w:val="center"/>
           </w:tcPr>
           <w:p>
             <w:pPr>
@@ -5562,7 +5452,6 @@
             </w:pPr>
             <w:r>
               <w:rPr>
-                <w:color w:val="282360"/>
                 <w:sz w:val="26"/>
                 <w:szCs w:val="26"/>
                 <w:rtl/>
@@ -8835,13 +8724,8 @@
       <w:pPr>
         <w:keepNext/>
         <w:keepLines/>
-        <w:pBdr>
-          <w:top w:val="single" w:sz="7" w:space="8" w:color="F0C45F"/>
-          <w:right w:val="single" w:sz="7" w:space="8" w:color="F0C45F"/>
-          <w:left w:val="single" w:sz="7" w:space="8" w:color="F0C45F"/>
-        </w:pBdr>
-        <w:shd w:val="clear" w:color="auto" w:fill="FFF8E7"/>
-        <w:spacing w:line="280" w:lineRule="auto" w:before="80" w:after="80"/>
+        <w:pageBreakBefore/>
+        <w:spacing w:line="223" w:lineRule="auto"/>
         <w:ind w:left="567" w:hanging="567"/>
         <w:jc w:val="both"/>
       </w:pPr>
@@ -8850,7 +8734,6 @@
           <w:rFonts w:hint="cs"/>
           <w:b/>
           <w:bCs/>
-          <w:color w:val="282360"/>
           <w:rtl/>
         </w:rPr>
         <w:t>۲۴-</w:t>
@@ -8859,7 +8742,6 @@
         <w:rPr>
           <w:b/>
           <w:bCs/>
-          <w:color w:val="282360"/>
           <w:rtl/>
         </w:rPr>
         <w:tab/>
@@ -8870,7 +8752,6 @@
           <w:rFonts w:hint="cs"/>
           <w:b/>
           <w:bCs/>
-          <w:color w:val="282360"/>
           <w:rtl/>
         </w:rPr>
         <w:t xml:space="preserve">انواع </w:t>
@@ -8879,7 +8760,6 @@
         <w:rPr>
           <w:b/>
           <w:bCs/>
-          <w:color w:val="282360"/>
           <w:rtl/>
         </w:rPr>
         <w:t>بافت‌های پوششی</w:t>
@@ -8889,7 +8769,6 @@
           <w:rFonts w:hint="cs"/>
           <w:b/>
           <w:bCs/>
-          <w:color w:val="282360"/>
           <w:rtl/>
         </w:rPr>
         <w:t>،</w:t>
@@ -8898,7 +8777,6 @@
         <w:rPr>
           <w:b/>
           <w:bCs/>
-          <w:color w:val="282360"/>
           <w:rtl/>
         </w:rPr>
         <w:t xml:space="preserve"> یاخته</w:t>
@@ -8908,7 +8786,6 @@
           <w:rFonts w:hint="cs"/>
           <w:b/>
           <w:bCs/>
-          <w:color w:val="282360"/>
           <w:rtl/>
         </w:rPr>
         <w:t>‌</w:t>
@@ -8917,7 +8794,6 @@
         <w:rPr>
           <w:b/>
           <w:bCs/>
-          <w:color w:val="282360"/>
           <w:rtl/>
         </w:rPr>
         <w:t>های متصل به غشای پایه، ظاهری مکعبی‌شکل دارند.</w:t>
@@ -8927,7 +8803,6 @@
           <w:rFonts w:hint="cs"/>
           <w:b/>
           <w:bCs/>
-          <w:color w:val="282360"/>
           <w:rtl/>
         </w:rPr>
         <w:t xml:space="preserve"> </w:t>
@@ -8936,7 +8811,6 @@
         <w:rPr>
           <w:b/>
           <w:bCs/>
-          <w:color w:val="282360"/>
           <w:rtl/>
         </w:rPr>
         <w:t>کدام گزینه</w:t>
@@ -8946,7 +8820,6 @@
           <w:rFonts w:hint="cs"/>
           <w:b/>
           <w:bCs/>
-          <w:color w:val="282360"/>
           <w:rtl/>
         </w:rPr>
         <w:t>،</w:t>
@@ -8955,7 +8828,6 @@
         <w:rPr>
           <w:b/>
           <w:bCs/>
-          <w:color w:val="282360"/>
           <w:rtl/>
         </w:rPr>
         <w:t xml:space="preserve"> در ارتباط با فقط برخی از آن‌ها درست است؟</w:t>
@@ -8965,14 +8837,12 @@
       <w:pPr>
         <w:keepNext/>
         <w:keepLines/>
-        <w:shd w:val="clear" w:color="auto" w:fill="FFF8E7"/>
-        <w:spacing w:line="223" w:lineRule="auto" w:after="65"/>
+        <w:spacing w:line="223" w:lineRule="auto"/>
         <w:ind w:left="837" w:hanging="270"/>
         <w:jc w:val="both"/>
       </w:pPr>
       <w:r>
         <w:rPr>
-          <w:color w:val="282360"/>
           <w:sz w:val="26"/>
           <w:szCs w:val="26"/>
           <w:rtl/>
@@ -8981,7 +8851,6 @@
       </w:r>
       <w:r>
         <w:rPr>
-          <w:color w:val="282360"/>
           <w:sz w:val="26"/>
           <w:szCs w:val="26"/>
           <w:rtl/>
@@ -8994,14 +8863,12 @@
       <w:pPr>
         <w:keepNext/>
         <w:keepLines/>
-        <w:shd w:val="clear" w:color="auto" w:fill="FFF8E7"/>
-        <w:spacing w:line="223" w:lineRule="auto" w:after="65"/>
+        <w:spacing w:line="223" w:lineRule="auto"/>
         <w:ind w:left="837" w:hanging="270"/>
         <w:jc w:val="both"/>
       </w:pPr>
       <w:r>
         <w:rPr>
-          <w:color w:val="282360"/>
           <w:sz w:val="26"/>
           <w:szCs w:val="26"/>
           <w:rtl/>
@@ -9010,7 +8877,6 @@
       </w:r>
       <w:r>
         <w:rPr>
-          <w:color w:val="282360"/>
           <w:sz w:val="26"/>
           <w:szCs w:val="26"/>
           <w:rtl/>
@@ -9023,14 +8889,12 @@
       <w:pPr>
         <w:keepNext/>
         <w:keepLines/>
-        <w:shd w:val="clear" w:color="auto" w:fill="FFF8E7"/>
-        <w:spacing w:line="223" w:lineRule="auto" w:after="65"/>
+        <w:spacing w:line="223" w:lineRule="auto"/>
         <w:ind w:left="837" w:hanging="270"/>
         <w:jc w:val="both"/>
       </w:pPr>
       <w:r>
         <w:rPr>
-          <w:color w:val="282360"/>
           <w:sz w:val="26"/>
           <w:szCs w:val="26"/>
           <w:rtl/>
@@ -9039,7 +8903,6 @@
       </w:r>
       <w:r>
         <w:rPr>
-          <w:color w:val="282360"/>
           <w:sz w:val="26"/>
           <w:szCs w:val="26"/>
           <w:rtl/>
@@ -9050,7 +8913,6 @@
       <w:r>
         <w:rPr>
           <w:rFonts w:hint="cs"/>
-          <w:color w:val="282360"/>
           <w:sz w:val="26"/>
           <w:szCs w:val="26"/>
           <w:rtl/>
@@ -9059,7 +8921,6 @@
       </w:r>
       <w:r>
         <w:rPr>
-          <w:color w:val="282360"/>
           <w:sz w:val="26"/>
           <w:szCs w:val="26"/>
           <w:rtl/>
@@ -9069,10 +8930,8 @@
     </w:p>
     <w:p>
       <w:pPr>
-        <w:keepNext/>
         <w:keepLines/>
-        <w:shd w:val="clear" w:color="auto" w:fill="FFF8E7"/>
-        <w:spacing w:line="223" w:lineRule="auto" w:after="65"/>
+        <w:spacing w:line="223" w:lineRule="auto"/>
         <w:ind w:left="837" w:hanging="270"/>
         <w:jc w:val="both"/>
         <w:rPr>
@@ -9081,7 +8940,6 @@
       </w:pPr>
       <w:r>
         <w:rPr>
-          <w:color w:val="282360"/>
           <w:sz w:val="26"/>
           <w:szCs w:val="26"/>
           <w:rtl/>
@@ -9090,7 +8948,6 @@
       </w:r>
       <w:r>
         <w:rPr>
-          <w:color w:val="282360"/>
           <w:sz w:val="26"/>
           <w:szCs w:val="26"/>
           <w:rtl/>
@@ -11217,20 +11074,14 @@
       <w:pPr>
         <w:keepNext/>
         <w:keepLines/>
-        <w:pBdr>
-          <w:top w:val="single" w:sz="7" w:space="8" w:color="F0C45F"/>
-          <w:right w:val="single" w:sz="7" w:space="8" w:color="F0C45F"/>
-          <w:left w:val="single" w:sz="7" w:space="8" w:color="F0C45F"/>
-        </w:pBdr>
-        <w:shd w:val="clear" w:color="auto" w:fill="FFF8E7"/>
-        <w:spacing w:line="280" w:lineRule="auto" w:before="80" w:after="80"/>
+        <w:pageBreakBefore/>
+        <w:spacing w:line="223" w:lineRule="auto"/>
         <w:jc w:val="both"/>
       </w:pPr>
       <w:r>
         <w:rPr>
           <w:b/>
           <w:bCs/>
-          <w:color w:val="282360"/>
           <w:rtl/>
         </w:rPr>
         <w:t>۲۵-</w:t>
@@ -11239,7 +11090,6 @@
         <w:rPr>
           <w:b/>
           <w:bCs/>
-          <w:color w:val="282360"/>
           <w:rtl/>
         </w:rPr>
         <w:tab/>
@@ -11250,7 +11100,6 @@
           <w:rFonts w:hint="cs"/>
           <w:b/>
           <w:bCs/>
-          <w:color w:val="282360"/>
           <w:rtl/>
         </w:rPr>
         <w:t>،</w:t>
@@ -11259,7 +11108,6 @@
         <w:rPr>
           <w:b/>
           <w:bCs/>
-          <w:color w:val="282360"/>
           <w:rtl/>
         </w:rPr>
         <w:t xml:space="preserve"> از دو بخش سر آب‌دوست و دم آب‌گریز تشکیل شده است. کدام گزینه بخش دم را در غشای یک یاختهٔ جانوری از بخش سر متمایز می‌کند؟ (دم در مرکز غشا و سر در اطراف آن قرار می‌گیرد.)</w:t>
@@ -11269,14 +11117,12 @@
       <w:pPr>
         <w:keepNext/>
         <w:keepLines/>
-        <w:shd w:val="clear" w:color="auto" w:fill="FFF8E7"/>
-        <w:spacing w:line="223" w:lineRule="auto" w:after="65"/>
+        <w:spacing w:line="223" w:lineRule="auto"/>
         <w:ind w:left="837" w:hanging="270"/>
         <w:jc w:val="both"/>
       </w:pPr>
       <w:r>
         <w:rPr>
-          <w:color w:val="282360"/>
           <w:sz w:val="26"/>
           <w:szCs w:val="26"/>
           <w:rtl/>
@@ -11285,7 +11131,6 @@
       </w:r>
       <w:r>
         <w:rPr>
-          <w:color w:val="282360"/>
           <w:sz w:val="26"/>
           <w:szCs w:val="26"/>
           <w:rtl/>
@@ -11298,14 +11143,12 @@
       <w:pPr>
         <w:keepNext/>
         <w:keepLines/>
-        <w:shd w:val="clear" w:color="auto" w:fill="FFF8E7"/>
-        <w:spacing w:line="223" w:lineRule="auto" w:after="65"/>
+        <w:spacing w:line="223" w:lineRule="auto"/>
         <w:ind w:left="837" w:hanging="270"/>
         <w:jc w:val="both"/>
       </w:pPr>
       <w:r>
         <w:rPr>
-          <w:color w:val="282360"/>
           <w:sz w:val="26"/>
           <w:szCs w:val="26"/>
           <w:rtl/>
@@ -11314,7 +11157,6 @@
       </w:r>
       <w:r>
         <w:rPr>
-          <w:color w:val="282360"/>
           <w:sz w:val="26"/>
           <w:szCs w:val="26"/>
           <w:rtl/>
@@ -11325,7 +11167,6 @@
       <w:r>
         <w:rPr>
           <w:rFonts w:hint="cs"/>
-          <w:color w:val="282360"/>
           <w:sz w:val="26"/>
           <w:szCs w:val="26"/>
           <w:rtl/>
@@ -11334,7 +11175,6 @@
       </w:r>
       <w:r>
         <w:rPr>
-          <w:color w:val="282360"/>
           <w:sz w:val="26"/>
           <w:szCs w:val="26"/>
           <w:rtl/>
@@ -11346,14 +11186,12 @@
       <w:pPr>
         <w:keepNext/>
         <w:keepLines/>
-        <w:shd w:val="clear" w:color="auto" w:fill="FFF8E7"/>
-        <w:spacing w:line="223" w:lineRule="auto" w:after="65"/>
+        <w:spacing w:line="223" w:lineRule="auto"/>
         <w:ind w:left="837" w:hanging="270"/>
         <w:jc w:val="both"/>
       </w:pPr>
       <w:r>
         <w:rPr>
-          <w:color w:val="282360"/>
           <w:sz w:val="26"/>
           <w:szCs w:val="26"/>
           <w:rtl/>
@@ -11362,7 +11200,6 @@
       </w:r>
       <w:r>
         <w:rPr>
-          <w:color w:val="282360"/>
           <w:sz w:val="26"/>
           <w:szCs w:val="26"/>
           <w:rtl/>
@@ -11373,10 +11210,8 @@
     </w:p>
     <w:p>
       <w:pPr>
-        <w:keepNext/>
         <w:keepLines/>
-        <w:shd w:val="clear" w:color="auto" w:fill="FFF8E7"/>
-        <w:spacing w:line="223" w:lineRule="auto" w:after="65"/>
+        <w:spacing w:line="223" w:lineRule="auto"/>
         <w:ind w:left="837" w:hanging="270"/>
         <w:jc w:val="both"/>
         <w:rPr>
@@ -11385,7 +11220,6 @@
       </w:pPr>
       <w:r>
         <w:rPr>
-          <w:color w:val="282360"/>
           <w:sz w:val="26"/>
           <w:szCs w:val="26"/>
           <w:rtl/>
@@ -11394,7 +11228,6 @@
       </w:r>
       <w:r>
         <w:rPr>
-          <w:color w:val="282360"/>
           <w:sz w:val="26"/>
           <w:szCs w:val="26"/>
           <w:rtl/>
@@ -11405,7 +11238,6 @@
       <w:r>
         <w:rPr>
           <w:rFonts w:hint="cs"/>
-          <w:color w:val="282360"/>
           <w:sz w:val="26"/>
           <w:szCs w:val="26"/>
           <w:rtl/>
@@ -11414,7 +11246,6 @@
       </w:r>
       <w:r>
         <w:rPr>
-          <w:color w:val="282360"/>
           <w:sz w:val="26"/>
           <w:szCs w:val="26"/>
           <w:rtl/>
@@ -11424,7 +11255,6 @@
       <w:r>
         <w:rPr>
           <w:rFonts w:hint="cs"/>
-          <w:color w:val="282360"/>
           <w:sz w:val="26"/>
           <w:szCs w:val="26"/>
           <w:rtl/>
@@ -11433,7 +11263,6 @@
       </w:r>
       <w:r>
         <w:rPr>
-          <w:color w:val="282360"/>
           <w:sz w:val="26"/>
           <w:szCs w:val="26"/>
           <w:rtl/>
@@ -13446,13 +13275,8 @@
       <w:pPr>
         <w:keepNext/>
         <w:keepLines/>
-        <w:pBdr>
-          <w:top w:val="single" w:sz="7" w:space="8" w:color="F0C45F"/>
-          <w:right w:val="single" w:sz="7" w:space="8" w:color="F0C45F"/>
-          <w:left w:val="single" w:sz="7" w:space="8" w:color="F0C45F"/>
-        </w:pBdr>
-        <w:shd w:val="clear" w:color="auto" w:fill="FFF8E7"/>
-        <w:spacing w:line="280" w:lineRule="auto" w:before="80" w:after="80"/>
+        <w:pageBreakBefore/>
+        <w:spacing w:line="223" w:lineRule="auto"/>
         <w:ind w:left="567" w:hanging="567"/>
         <w:jc w:val="both"/>
       </w:pPr>
@@ -13460,7 +13284,6 @@
         <w:rPr>
           <w:b/>
           <w:bCs/>
-          <w:color w:val="282360"/>
           <w:rtl/>
         </w:rPr>
         <w:lastRenderedPageBreak/>
@@ -13470,7 +13293,6 @@
         <w:rPr>
           <w:b/>
           <w:bCs/>
-          <w:color w:val="282360"/>
           <w:rtl/>
         </w:rPr>
         <w:tab/>
@@ -13481,7 +13303,6 @@
           <w:rFonts w:hint="cs"/>
           <w:b/>
           <w:bCs/>
-          <w:color w:val="282360"/>
           <w:rtl/>
         </w:rPr>
         <w:t xml:space="preserve">، </w:t>
@@ -13490,7 +13311,6 @@
         <w:rPr>
           <w:b/>
           <w:bCs/>
-          <w:color w:val="282360"/>
           <w:rtl/>
         </w:rPr>
         <w:t>کدام عبارت درست است؟</w:t>
@@ -13500,14 +13320,12 @@
       <w:pPr>
         <w:keepNext/>
         <w:keepLines/>
-        <w:shd w:val="clear" w:color="auto" w:fill="FFF8E7"/>
-        <w:spacing w:line="223" w:lineRule="auto" w:after="65"/>
+        <w:spacing w:line="223" w:lineRule="auto"/>
         <w:ind w:left="837" w:hanging="270"/>
         <w:jc w:val="both"/>
       </w:pPr>
       <w:r>
         <w:rPr>
-          <w:color w:val="282360"/>
           <w:sz w:val="26"/>
           <w:szCs w:val="26"/>
           <w:rtl/>
@@ -13516,7 +13334,6 @@
       </w:r>
       <w:r>
         <w:rPr>
-          <w:color w:val="282360"/>
           <w:sz w:val="26"/>
           <w:szCs w:val="26"/>
           <w:rtl/>
@@ -13529,14 +13346,12 @@
       <w:pPr>
         <w:keepNext/>
         <w:keepLines/>
-        <w:shd w:val="clear" w:color="auto" w:fill="FFF8E7"/>
-        <w:spacing w:line="223" w:lineRule="auto" w:after="65"/>
+        <w:spacing w:line="223" w:lineRule="auto"/>
         <w:ind w:left="837" w:hanging="270"/>
         <w:jc w:val="both"/>
       </w:pPr>
       <w:r>
         <w:rPr>
-          <w:color w:val="282360"/>
           <w:sz w:val="26"/>
           <w:szCs w:val="26"/>
           <w:rtl/>
@@ -13545,7 +13360,6 @@
       </w:r>
       <w:r>
         <w:rPr>
-          <w:color w:val="282360"/>
           <w:sz w:val="26"/>
           <w:szCs w:val="26"/>
           <w:rtl/>
@@ -13556,7 +13370,6 @@
       <w:r>
         <w:rPr>
           <w:rFonts w:hint="cs"/>
-          <w:color w:val="282360"/>
           <w:sz w:val="26"/>
           <w:szCs w:val="26"/>
           <w:rtl/>
@@ -13565,7 +13378,6 @@
       </w:r>
       <w:r>
         <w:rPr>
-          <w:color w:val="282360"/>
           <w:sz w:val="26"/>
           <w:szCs w:val="26"/>
           <w:rtl/>
@@ -13575,7 +13387,6 @@
       <w:r>
         <w:rPr>
           <w:rFonts w:hint="cs"/>
-          <w:color w:val="282360"/>
           <w:sz w:val="26"/>
           <w:szCs w:val="26"/>
           <w:rtl/>
@@ -13584,7 +13395,6 @@
       </w:r>
       <w:r>
         <w:rPr>
-          <w:color w:val="282360"/>
           <w:sz w:val="26"/>
           <w:szCs w:val="26"/>
           <w:rtl/>
@@ -13596,14 +13406,12 @@
       <w:pPr>
         <w:keepNext/>
         <w:keepLines/>
-        <w:shd w:val="clear" w:color="auto" w:fill="FFF8E7"/>
-        <w:spacing w:line="223" w:lineRule="auto" w:after="65"/>
+        <w:spacing w:line="223" w:lineRule="auto"/>
         <w:ind w:left="837" w:hanging="270"/>
         <w:jc w:val="both"/>
       </w:pPr>
       <w:r>
         <w:rPr>
-          <w:color w:val="282360"/>
           <w:sz w:val="26"/>
           <w:szCs w:val="26"/>
           <w:rtl/>
@@ -13612,7 +13420,6 @@
       </w:r>
       <w:r>
         <w:rPr>
-          <w:color w:val="282360"/>
           <w:sz w:val="26"/>
           <w:szCs w:val="26"/>
           <w:rtl/>
@@ -13623,10 +13430,8 @@
     </w:p>
     <w:p>
       <w:pPr>
-        <w:keepNext/>
         <w:keepLines/>
-        <w:shd w:val="clear" w:color="auto" w:fill="FFF8E7"/>
-        <w:spacing w:line="223" w:lineRule="auto" w:after="65"/>
+        <w:spacing w:line="223" w:lineRule="auto"/>
         <w:ind w:left="837" w:hanging="270"/>
         <w:jc w:val="both"/>
         <w:rPr>
@@ -13635,7 +13440,6 @@
       </w:pPr>
       <w:r>
         <w:rPr>
-          <w:color w:val="282360"/>
           <w:sz w:val="26"/>
           <w:szCs w:val="26"/>
           <w:rtl/>
@@ -13644,7 +13448,6 @@
       </w:r>
       <w:r>
         <w:rPr>
-          <w:color w:val="282360"/>
           <w:sz w:val="26"/>
           <w:szCs w:val="26"/>
           <w:rtl/>
@@ -15351,13 +15154,8 @@
       <w:pPr>
         <w:keepNext/>
         <w:keepLines/>
-        <w:pBdr>
-          <w:top w:val="single" w:sz="7" w:space="8" w:color="F0C45F"/>
-          <w:right w:val="single" w:sz="7" w:space="8" w:color="F0C45F"/>
-          <w:left w:val="single" w:sz="7" w:space="8" w:color="F0C45F"/>
-        </w:pBdr>
-        <w:shd w:val="clear" w:color="auto" w:fill="FFF8E7"/>
-        <w:spacing w:line="280" w:lineRule="auto" w:before="80" w:after="80"/>
+        <w:pageBreakBefore/>
+        <w:spacing w:line="223" w:lineRule="auto"/>
         <w:ind w:left="567" w:hanging="567"/>
         <w:jc w:val="both"/>
       </w:pPr>
@@ -15365,7 +15163,6 @@
         <w:rPr>
           <w:b/>
           <w:bCs/>
-          <w:color w:val="282360"/>
           <w:rtl/>
         </w:rPr>
         <w:t>۲۷-</w:t>
@@ -15374,7 +15171,6 @@
         <w:rPr>
           <w:b/>
           <w:bCs/>
-          <w:color w:val="282360"/>
           <w:rtl/>
         </w:rPr>
         <w:tab/>
@@ -15385,7 +15181,6 @@
           <w:rFonts w:hint="cs"/>
           <w:b/>
           <w:bCs/>
-          <w:color w:val="282360"/>
           <w:rtl/>
         </w:rPr>
         <w:t xml:space="preserve"> کتاب درسی</w:t>
@@ -15394,7 +15189,6 @@
         <w:rPr>
           <w:b/>
           <w:bCs/>
-          <w:color w:val="282360"/>
           <w:rtl/>
         </w:rPr>
         <w:t xml:space="preserve"> در خصوص اندامک‌های یاخته، کدام </w:t>
@@ -15404,7 +15198,6 @@
           <w:rFonts w:hint="cs"/>
           <w:b/>
           <w:bCs/>
-          <w:color w:val="282360"/>
           <w:rtl/>
         </w:rPr>
         <w:t>مورد</w:t>
@@ -15413,7 +15206,6 @@
         <w:rPr>
           <w:b/>
           <w:bCs/>
-          <w:color w:val="282360"/>
           <w:rtl/>
         </w:rPr>
         <w:t xml:space="preserve"> </w:t>
@@ -15422,7 +15214,6 @@
         <w:rPr>
           <w:b/>
           <w:bCs/>
-          <w:color w:val="282360"/>
           <w:u w:val="single"/>
           <w:rtl/>
         </w:rPr>
@@ -15432,7 +15223,6 @@
         <w:rPr>
           <w:b/>
           <w:bCs/>
-          <w:color w:val="282360"/>
           <w:rtl/>
         </w:rPr>
         <w:t xml:space="preserve"> است؟</w:t>
@@ -15442,14 +15232,12 @@
       <w:pPr>
         <w:keepNext/>
         <w:keepLines/>
-        <w:shd w:val="clear" w:color="auto" w:fill="FFF8E7"/>
-        <w:spacing w:line="223" w:lineRule="auto" w:after="65"/>
+        <w:spacing w:line="223" w:lineRule="auto"/>
         <w:ind w:left="837" w:hanging="270"/>
         <w:jc w:val="both"/>
       </w:pPr>
       <w:r>
         <w:rPr>
-          <w:color w:val="282360"/>
           <w:sz w:val="26"/>
           <w:szCs w:val="26"/>
           <w:rtl/>
@@ -15458,7 +15246,6 @@
       </w:r>
       <w:r>
         <w:rPr>
-          <w:color w:val="282360"/>
           <w:sz w:val="26"/>
           <w:szCs w:val="26"/>
           <w:rtl/>
@@ -15469,97 +15256,85 @@
     </w:p>
     <w:p>
       <w:pPr>
+        <w:keepLines/>
+        <w:spacing w:line="223" w:lineRule="auto"/>
+        <w:ind w:left="837" w:hanging="270"/>
+        <w:jc w:val="both"/>
+      </w:pPr>
+      <w:r>
+        <w:rPr>
+          <w:sz w:val="26"/>
+          <w:szCs w:val="26"/>
+          <w:rtl/>
+        </w:rPr>
+        <w:t>۲)</w:t>
+      </w:r>
+      <w:r>
+        <w:rPr>
+          <w:rFonts w:hint="cs"/>
+          <w:sz w:val="26"/>
+          <w:szCs w:val="26"/>
+          <w:rtl/>
+        </w:rPr>
+        <w:tab/>
+      </w:r>
+      <w:r>
+        <w:rPr>
+          <w:sz w:val="26"/>
+          <w:szCs w:val="26"/>
+          <w:rtl/>
+        </w:rPr>
+        <w:t>هر اندامکی که در تولید غشا نقش دارد، در سراسر سیتوپلاسم گسترش یافته است.</w:t>
+      </w:r>
+    </w:p>
+    <w:p>
+      <w:pPr>
         <w:keepNext/>
         <w:keepLines/>
-        <w:shd w:val="clear" w:color="auto" w:fill="FFF8E7"/>
-        <w:spacing w:line="223" w:lineRule="auto" w:after="65"/>
+        <w:spacing w:line="223" w:lineRule="auto"/>
         <w:ind w:left="837" w:hanging="270"/>
         <w:jc w:val="both"/>
       </w:pPr>
       <w:r>
         <w:rPr>
-          <w:color w:val="282360"/>
           <w:sz w:val="26"/>
           <w:szCs w:val="26"/>
           <w:rtl/>
         </w:rPr>
-        <w:t>۲)</w:t>
-      </w:r>
-      <w:r>
-        <w:rPr>
-          <w:rFonts w:hint="cs"/>
-          <w:color w:val="282360"/>
+        <w:t>۳)</w:t>
+      </w:r>
+      <w:r>
+        <w:rPr>
           <w:sz w:val="26"/>
           <w:szCs w:val="26"/>
           <w:rtl/>
         </w:rPr>
         <w:tab/>
-      </w:r>
-      <w:r>
-        <w:rPr>
-          <w:color w:val="282360"/>
+        <w:t>هر اندامکی که دارای آنزیم‌های تجزیه‌کنندهٔ مواد است، قابلیت حرکت در یاخته را دارد.</w:t>
+      </w:r>
+    </w:p>
+    <w:p>
+      <w:pPr>
+        <w:keepLines/>
+        <w:spacing w:line="223" w:lineRule="auto"/>
+        <w:ind w:left="837" w:hanging="270"/>
+        <w:jc w:val="both"/>
+        <w:rPr>
+          <w:b/>
+          <w:bCs/>
+          <w:rtl/>
+        </w:rPr>
+      </w:pPr>
+      <w:r>
+        <w:rPr>
           <w:sz w:val="26"/>
           <w:szCs w:val="26"/>
           <w:rtl/>
         </w:rPr>
-        <w:t>هر اندامکی که در تولید غشا نقش دارد، در سراسر سیتوپلاسم گسترش یافته است.</w:t>
-      </w:r>
-    </w:p>
-    <w:p>
-      <w:pPr>
-        <w:keepNext/>
-        <w:keepLines/>
-        <w:shd w:val="clear" w:color="auto" w:fill="FFF8E7"/>
-        <w:spacing w:line="223" w:lineRule="auto" w:after="65"/>
-        <w:ind w:left="837" w:hanging="270"/>
-        <w:jc w:val="both"/>
-      </w:pPr>
-      <w:r>
-        <w:rPr>
-          <w:color w:val="282360"/>
-          <w:sz w:val="26"/>
-          <w:szCs w:val="26"/>
-          <w:rtl/>
-        </w:rPr>
-        <w:t>۳)</w:t>
-      </w:r>
-      <w:r>
-        <w:rPr>
-          <w:color w:val="282360"/>
-          <w:sz w:val="26"/>
-          <w:szCs w:val="26"/>
-          <w:rtl/>
-        </w:rPr>
-        <w:tab/>
-        <w:t>هر اندامکی که دارای آنزیم‌های تجزیه‌کنندهٔ مواد است، قابلیت حرکت در یاخته را دارد.</w:t>
-      </w:r>
-    </w:p>
-    <w:p>
-      <w:pPr>
-        <w:keepNext/>
-        <w:keepLines/>
-        <w:shd w:val="clear" w:color="auto" w:fill="FFF8E7"/>
-        <w:spacing w:line="223" w:lineRule="auto" w:after="65"/>
-        <w:ind w:left="837" w:hanging="270"/>
-        <w:jc w:val="both"/>
-        <w:rPr>
-          <w:b/>
-          <w:bCs/>
-          <w:rtl/>
-        </w:rPr>
-      </w:pPr>
-      <w:r>
-        <w:rPr>
-          <w:color w:val="282360"/>
-          <w:sz w:val="26"/>
-          <w:szCs w:val="26"/>
-          <w:rtl/>
-        </w:rPr>
         <w:t>۴)</w:t>
       </w:r>
       <w:r>
         <w:rPr>
-          <w:color w:val="282360"/>
           <w:sz w:val="26"/>
           <w:szCs w:val="26"/>
           <w:rtl/>
@@ -18430,13 +18205,8 @@
       <w:pPr>
         <w:keepNext/>
         <w:keepLines/>
-        <w:pBdr>
-          <w:top w:val="single" w:sz="7" w:space="8" w:color="F0C45F"/>
-          <w:right w:val="single" w:sz="7" w:space="8" w:color="F0C45F"/>
-          <w:left w:val="single" w:sz="7" w:space="8" w:color="F0C45F"/>
-        </w:pBdr>
-        <w:shd w:val="clear" w:color="auto" w:fill="FFF8E7"/>
-        <w:spacing w:line="280" w:lineRule="auto" w:before="80" w:after="80"/>
+        <w:pageBreakBefore/>
+        <w:spacing w:line="223" w:lineRule="auto"/>
         <w:ind w:left="567" w:hanging="567"/>
         <w:jc w:val="both"/>
       </w:pPr>
@@ -18444,7 +18214,6 @@
         <w:rPr>
           <w:b/>
           <w:bCs/>
-          <w:color w:val="282360"/>
           <w:rtl/>
         </w:rPr>
         <w:t>۲۸-</w:t>
@@ -18453,7 +18222,6 @@
         <w:rPr>
           <w:b/>
           <w:bCs/>
-          <w:color w:val="282360"/>
           <w:rtl/>
         </w:rPr>
         <w:tab/>
@@ -18464,7 +18232,6 @@
           <w:rFonts w:hint="cs"/>
           <w:b/>
           <w:bCs/>
-          <w:color w:val="282360"/>
           <w:rtl/>
         </w:rPr>
         <w:t>مورد</w:t>
@@ -18473,7 +18240,6 @@
         <w:rPr>
           <w:b/>
           <w:bCs/>
-          <w:color w:val="282360"/>
           <w:rtl/>
         </w:rPr>
         <w:t xml:space="preserve"> در ارتباط با هر نوع مولکول زیستی که در تعداد، تکرار و ترکیب قرارگیری واحدهای سازندهٔ خود متنوع </w:t>
@@ -18483,7 +18249,6 @@
           <w:rFonts w:hint="cs"/>
           <w:b/>
           <w:bCs/>
-          <w:color w:val="282360"/>
           <w:rtl/>
         </w:rPr>
         <w:t xml:space="preserve">است، </w:t>
@@ -18492,7 +18257,6 @@
         <w:rPr>
           <w:b/>
           <w:bCs/>
-          <w:color w:val="282360"/>
           <w:rtl/>
         </w:rPr>
         <w:t>درست است؟</w:t>
@@ -18502,14 +18266,12 @@
       <w:pPr>
         <w:keepNext/>
         <w:keepLines/>
-        <w:shd w:val="clear" w:color="auto" w:fill="FFF8E7"/>
-        <w:spacing w:line="223" w:lineRule="auto" w:after="65"/>
+        <w:spacing w:line="223" w:lineRule="auto"/>
         <w:ind w:left="837" w:hanging="270"/>
         <w:jc w:val="both"/>
       </w:pPr>
       <w:r>
         <w:rPr>
-          <w:color w:val="282360"/>
           <w:sz w:val="26"/>
           <w:szCs w:val="26"/>
           <w:rtl/>
@@ -18518,7 +18280,6 @@
       </w:r>
       <w:r>
         <w:rPr>
-          <w:color w:val="282360"/>
           <w:sz w:val="26"/>
           <w:szCs w:val="26"/>
           <w:rtl/>
@@ -18529,7 +18290,6 @@
       <w:r>
         <w:rPr>
           <w:rFonts w:hint="cs"/>
-          <w:color w:val="282360"/>
           <w:sz w:val="26"/>
           <w:szCs w:val="26"/>
           <w:rtl/>
@@ -18538,7 +18298,6 @@
       </w:r>
       <w:r>
         <w:rPr>
-          <w:color w:val="282360"/>
           <w:sz w:val="26"/>
           <w:szCs w:val="26"/>
           <w:rtl/>
@@ -18550,14 +18309,12 @@
       <w:pPr>
         <w:keepNext/>
         <w:keepLines/>
-        <w:shd w:val="clear" w:color="auto" w:fill="FFF8E7"/>
-        <w:spacing w:line="223" w:lineRule="auto" w:after="65"/>
+        <w:spacing w:line="223" w:lineRule="auto"/>
         <w:ind w:left="837" w:hanging="270"/>
         <w:jc w:val="both"/>
       </w:pPr>
       <w:r>
         <w:rPr>
-          <w:color w:val="282360"/>
           <w:sz w:val="26"/>
           <w:szCs w:val="26"/>
           <w:rtl/>
@@ -18566,7 +18323,6 @@
       </w:r>
       <w:r>
         <w:rPr>
-          <w:color w:val="282360"/>
           <w:sz w:val="26"/>
           <w:szCs w:val="26"/>
           <w:rtl/>
@@ -18579,14 +18335,12 @@
       <w:pPr>
         <w:keepNext/>
         <w:keepLines/>
-        <w:shd w:val="clear" w:color="auto" w:fill="FFF8E7"/>
-        <w:spacing w:line="223" w:lineRule="auto" w:after="65"/>
+        <w:spacing w:line="223" w:lineRule="auto"/>
         <w:ind w:left="837" w:hanging="270"/>
         <w:jc w:val="both"/>
       </w:pPr>
       <w:r>
         <w:rPr>
-          <w:color w:val="282360"/>
           <w:sz w:val="26"/>
           <w:szCs w:val="26"/>
           <w:rtl/>
@@ -18595,7 +18349,6 @@
       </w:r>
       <w:r>
         <w:rPr>
-          <w:color w:val="282360"/>
           <w:sz w:val="26"/>
           <w:szCs w:val="26"/>
           <w:rtl/>
@@ -18606,10 +18359,8 @@
     </w:p>
     <w:p>
       <w:pPr>
-        <w:keepNext/>
         <w:keepLines/>
-        <w:shd w:val="clear" w:color="auto" w:fill="FFF8E7"/>
-        <w:spacing w:line="223" w:lineRule="auto" w:after="65"/>
+        <w:spacing w:line="223" w:lineRule="auto"/>
         <w:ind w:left="837" w:hanging="270"/>
         <w:jc w:val="both"/>
         <w:rPr>
@@ -18618,7 +18369,6 @@
       </w:pPr>
       <w:r>
         <w:rPr>
-          <w:color w:val="282360"/>
           <w:sz w:val="26"/>
           <w:szCs w:val="26"/>
           <w:rtl/>
@@ -18627,7 +18377,6 @@
       </w:r>
       <w:r>
         <w:rPr>
-          <w:color w:val="282360"/>
           <w:sz w:val="26"/>
           <w:szCs w:val="26"/>
           <w:rtl/>
@@ -18638,7 +18387,6 @@
       <w:r>
         <w:rPr>
           <w:rFonts w:hint="cs"/>
-          <w:color w:val="282360"/>
           <w:sz w:val="26"/>
           <w:szCs w:val="26"/>
           <w:rtl/>
@@ -18647,7 +18395,6 @@
       </w:r>
       <w:r>
         <w:rPr>
-          <w:color w:val="282360"/>
           <w:sz w:val="26"/>
           <w:szCs w:val="26"/>
           <w:rtl/>
@@ -20705,13 +20452,8 @@
       <w:pPr>
         <w:keepNext/>
         <w:keepLines/>
-        <w:pBdr>
-          <w:top w:val="single" w:sz="7" w:space="8" w:color="F0C45F"/>
-          <w:right w:val="single" w:sz="7" w:space="8" w:color="F0C45F"/>
-          <w:left w:val="single" w:sz="7" w:space="8" w:color="F0C45F"/>
-        </w:pBdr>
-        <w:shd w:val="clear" w:color="auto" w:fill="FFF8E7"/>
-        <w:spacing w:line="280" w:lineRule="auto" w:before="80" w:after="80"/>
+        <w:pageBreakBefore/>
+        <w:spacing w:line="223" w:lineRule="auto"/>
         <w:ind w:left="567" w:hanging="567"/>
         <w:jc w:val="both"/>
       </w:pPr>
@@ -20719,7 +20461,6 @@
         <w:rPr>
           <w:b/>
           <w:bCs/>
-          <w:color w:val="282360"/>
           <w:rtl/>
         </w:rPr>
         <w:t>۲۹-</w:t>
@@ -20728,7 +20469,6 @@
         <w:rPr>
           <w:b/>
           <w:bCs/>
-          <w:color w:val="282360"/>
           <w:rtl/>
         </w:rPr>
         <w:tab/>
@@ -20739,8 +20479,7 @@
       <w:pPr>
         <w:keepNext/>
         <w:keepLines/>
-        <w:shd w:val="clear" w:color="auto" w:fill="FFF8E7"/>
-        <w:spacing w:line="223" w:lineRule="auto" w:after="65"/>
+        <w:spacing w:line="223" w:lineRule="auto"/>
         <w:ind w:left="567"/>
         <w:jc w:val="both"/>
       </w:pPr>
@@ -20748,7 +20487,6 @@
         <w:rPr>
           <w:b/>
           <w:bCs/>
-          <w:color w:val="282360"/>
           <w:rtl/>
         </w:rPr>
         <w:t>الف: مشاهدهٔ یاخته‌های دوکی‌شکل</w:t>
@@ -20758,8 +20496,7 @@
       <w:pPr>
         <w:keepNext/>
         <w:keepLines/>
-        <w:shd w:val="clear" w:color="auto" w:fill="FFF8E7"/>
-        <w:spacing w:line="223" w:lineRule="auto" w:after="65"/>
+        <w:spacing w:line="223" w:lineRule="auto"/>
         <w:ind w:left="567"/>
         <w:jc w:val="both"/>
       </w:pPr>
@@ -20767,7 +20504,6 @@
         <w:rPr>
           <w:b/>
           <w:bCs/>
-          <w:color w:val="282360"/>
           <w:rtl/>
         </w:rPr>
         <w:t>ب: رشته‌های کلاژن کمتر درون مادهٔ زمینه‌ای</w:t>
@@ -20777,8 +20513,7 @@
       <w:pPr>
         <w:keepNext/>
         <w:keepLines/>
-        <w:shd w:val="clear" w:color="auto" w:fill="FFF8E7"/>
-        <w:spacing w:line="223" w:lineRule="auto" w:after="65"/>
+        <w:spacing w:line="223" w:lineRule="auto"/>
         <w:ind w:left="567"/>
         <w:jc w:val="both"/>
       </w:pPr>
@@ -20786,7 +20521,6 @@
         <w:rPr>
           <w:b/>
           <w:bCs/>
-          <w:color w:val="282360"/>
           <w:rtl/>
         </w:rPr>
         <w:t>ج: حضور یاخته‌های انگشتری‌شکل</w:t>
@@ -20796,8 +20530,7 @@
       <w:pPr>
         <w:keepNext/>
         <w:keepLines/>
-        <w:shd w:val="clear" w:color="auto" w:fill="FFF8E7"/>
-        <w:spacing w:line="223" w:lineRule="auto" w:after="65"/>
+        <w:spacing w:line="223" w:lineRule="auto"/>
         <w:ind w:left="567"/>
         <w:jc w:val="both"/>
       </w:pPr>
@@ -20805,7 +20538,6 @@
         <w:rPr>
           <w:b/>
           <w:bCs/>
-          <w:color w:val="282360"/>
           <w:rtl/>
         </w:rPr>
         <w:t>د: دارای گلیکوپروتئین‌های بیشتر</w:t>
@@ -20816,19 +20548,17 @@
         <w:bidiVisual/>
         <w:tblW w:w="9772" w:type="dxa"/>
         <w:tblBorders>
-          <w:top w:val="single" w:sz="4" w:space="0" w:color="F0C45F"/>
-          <w:left w:val="single" w:sz="4" w:space="0" w:color="F0C45F"/>
-          <w:bottom w:val="single" w:sz="4" w:space="0" w:color="F0C45F"/>
-          <w:right w:val="single" w:sz="4" w:space="0" w:color="F0C45F"/>
-          <w:insideH w:val="single" w:sz="4" w:space="0" w:color="F0C45F"/>
-          <w:insideV w:val="single" w:sz="4" w:space="0" w:color="F0C45F"/>
+          <w:top w:val="nil"/>
+          <w:left w:val="nil"/>
+          <w:bottom w:val="nil"/>
+          <w:right w:val="nil"/>
+          <w:insideH w:val="nil"/>
+          <w:insideV w:val="nil"/>
         </w:tblBorders>
         <w:tblLayout w:type="fixed"/>
         <w:tblCellMar>
-          <w:top w:w="85" w:type="dxa"/>
-          <w:left w:w="100" w:type="dxa"/>
-          <w:bottom w:w="85" w:type="dxa"/>
-          <w:right w:w="100" w:type="dxa"/>
+          <w:left w:w="0" w:type="dxa"/>
+          <w:right w:w="0" w:type="dxa"/>
         </w:tblCellMar>
         <w:tblLook w:val="04A0" w:firstRow="1" w:lastRow="0" w:firstColumn="1" w:lastColumn="0" w:noHBand="0" w:noVBand="1"/>
       </w:tblPr>
@@ -20845,8 +20575,6 @@
         <w:tc>
           <w:tcPr>
             <w:tcW w:w="2868" w:type="dxa"/>
-            <w:shd w:val="clear" w:color="auto" w:fill="FFF8E7"/>
-            <w:vAlign w:val="center"/>
           </w:tcPr>
           <w:p>
             <w:pPr>
@@ -20856,7 +20584,6 @@
             </w:pPr>
             <w:r>
               <w:rPr>
-                <w:color w:val="282360"/>
                 <w:sz w:val="26"/>
                 <w:szCs w:val="26"/>
                 <w:rtl/>
@@ -20868,8 +20595,6 @@
         <w:tc>
           <w:tcPr>
             <w:tcW w:w="2301" w:type="dxa"/>
-            <w:shd w:val="clear" w:color="auto" w:fill="FFF8E7"/>
-            <w:vAlign w:val="center"/>
           </w:tcPr>
           <w:p>
             <w:pPr>
@@ -20878,7 +20603,6 @@
             </w:pPr>
             <w:r>
               <w:rPr>
-                <w:color w:val="282360"/>
                 <w:sz w:val="26"/>
                 <w:szCs w:val="26"/>
                 <w:rtl/>
@@ -20890,8 +20614,6 @@
         <w:tc>
           <w:tcPr>
             <w:tcW w:w="2301" w:type="dxa"/>
-            <w:shd w:val="clear" w:color="auto" w:fill="FFF8E7"/>
-            <w:vAlign w:val="center"/>
           </w:tcPr>
           <w:p>
             <w:pPr>
@@ -20900,7 +20622,6 @@
             </w:pPr>
             <w:r>
               <w:rPr>
-                <w:color w:val="282360"/>
                 <w:sz w:val="26"/>
                 <w:szCs w:val="26"/>
                 <w:rtl/>
@@ -20912,8 +20633,6 @@
         <w:tc>
           <w:tcPr>
             <w:tcW w:w="2302" w:type="dxa"/>
-            <w:shd w:val="clear" w:color="auto" w:fill="FFF8E7"/>
-            <w:vAlign w:val="center"/>
           </w:tcPr>
           <w:p>
             <w:pPr>
@@ -20922,7 +20641,6 @@
             </w:pPr>
             <w:r>
               <w:rPr>
-                <w:color w:val="282360"/>
                 <w:sz w:val="26"/>
                 <w:szCs w:val="26"/>
                 <w:rtl/>
@@ -24190,13 +23908,8 @@
       <w:pPr>
         <w:keepNext/>
         <w:keepLines/>
-        <w:pBdr>
-          <w:top w:val="single" w:sz="7" w:space="8" w:color="F0C45F"/>
-          <w:right w:val="single" w:sz="7" w:space="8" w:color="F0C45F"/>
-          <w:left w:val="single" w:sz="7" w:space="8" w:color="F0C45F"/>
-        </w:pBdr>
-        <w:shd w:val="clear" w:color="auto" w:fill="FFF8E7"/>
-        <w:spacing w:line="280" w:lineRule="auto" w:before="80" w:after="80"/>
+        <w:pageBreakBefore/>
+        <w:spacing w:line="223" w:lineRule="auto"/>
         <w:ind w:left="567" w:hanging="567"/>
         <w:jc w:val="both"/>
       </w:pPr>
@@ -24205,7 +23918,6 @@
           <w:rFonts w:hint="cs"/>
           <w:b/>
           <w:bCs/>
-          <w:color w:val="282360"/>
           <w:rtl/>
         </w:rPr>
         <w:t>۳۰</w:t>
@@ -24214,7 +23926,6 @@
         <w:rPr>
           <w:b/>
           <w:bCs/>
-          <w:color w:val="282360"/>
           <w:rtl/>
         </w:rPr>
         <w:t>-</w:t>
@@ -24223,7 +23934,6 @@
         <w:rPr>
           <w:b/>
           <w:bCs/>
-          <w:color w:val="282360"/>
           <w:rtl/>
         </w:rPr>
         <w:tab/>
@@ -24234,14 +23944,12 @@
       <w:pPr>
         <w:keepNext/>
         <w:keepLines/>
-        <w:shd w:val="clear" w:color="auto" w:fill="FFF8E7"/>
-        <w:spacing w:line="223" w:lineRule="auto" w:after="65"/>
+        <w:spacing w:line="223" w:lineRule="auto"/>
         <w:ind w:left="837" w:hanging="270"/>
         <w:jc w:val="both"/>
       </w:pPr>
       <w:r>
         <w:rPr>
-          <w:color w:val="282360"/>
           <w:sz w:val="26"/>
           <w:szCs w:val="26"/>
           <w:rtl/>
@@ -24250,7 +23958,6 @@
       </w:r>
       <w:r>
         <w:rPr>
-          <w:color w:val="282360"/>
           <w:sz w:val="26"/>
           <w:szCs w:val="26"/>
           <w:rtl/>
@@ -24263,14 +23970,12 @@
       <w:pPr>
         <w:keepNext/>
         <w:keepLines/>
-        <w:shd w:val="clear" w:color="auto" w:fill="FFF8E7"/>
-        <w:spacing w:line="223" w:lineRule="auto" w:after="65"/>
+        <w:spacing w:line="223" w:lineRule="auto"/>
         <w:ind w:left="837" w:hanging="270"/>
         <w:jc w:val="both"/>
       </w:pPr>
       <w:r>
         <w:rPr>
-          <w:color w:val="282360"/>
           <w:sz w:val="26"/>
           <w:szCs w:val="26"/>
           <w:rtl/>
@@ -24279,7 +23984,6 @@
       </w:r>
       <w:r>
         <w:rPr>
-          <w:color w:val="282360"/>
           <w:sz w:val="26"/>
           <w:szCs w:val="26"/>
           <w:rtl/>
@@ -24290,7 +23994,6 @@
       <w:r>
         <w:rPr>
           <w:rFonts w:hint="cs"/>
-          <w:color w:val="282360"/>
           <w:sz w:val="26"/>
           <w:szCs w:val="26"/>
           <w:rtl/>
@@ -24299,7 +24002,6 @@
       </w:r>
       <w:r>
         <w:rPr>
-          <w:color w:val="282360"/>
           <w:sz w:val="26"/>
           <w:szCs w:val="26"/>
           <w:rtl/>
@@ -24311,14 +24013,12 @@
       <w:pPr>
         <w:keepNext/>
         <w:keepLines/>
-        <w:shd w:val="clear" w:color="auto" w:fill="FFF8E7"/>
-        <w:spacing w:line="223" w:lineRule="auto" w:after="65"/>
+        <w:spacing w:line="223" w:lineRule="auto"/>
         <w:ind w:left="837" w:hanging="270"/>
         <w:jc w:val="both"/>
       </w:pPr>
       <w:r>
         <w:rPr>
-          <w:color w:val="282360"/>
           <w:sz w:val="26"/>
           <w:szCs w:val="26"/>
           <w:rtl/>
@@ -24327,7 +24027,6 @@
       </w:r>
       <w:r>
         <w:rPr>
-          <w:color w:val="282360"/>
           <w:sz w:val="26"/>
           <w:szCs w:val="26"/>
           <w:rtl/>
@@ -24338,10 +24037,8 @@
     </w:p>
     <w:p>
       <w:pPr>
-        <w:keepNext/>
         <w:keepLines/>
-        <w:shd w:val="clear" w:color="auto" w:fill="FFF8E7"/>
-        <w:spacing w:line="223" w:lineRule="auto" w:after="65"/>
+        <w:spacing w:line="223" w:lineRule="auto"/>
         <w:ind w:left="837" w:hanging="270"/>
         <w:jc w:val="both"/>
         <w:rPr>
@@ -24350,7 +24047,6 @@
       </w:pPr>
       <w:r>
         <w:rPr>
-          <w:color w:val="282360"/>
           <w:sz w:val="26"/>
           <w:szCs w:val="26"/>
           <w:rtl/>
@@ -24359,7 +24055,6 @@
       </w:r>
       <w:r>
         <w:rPr>
-          <w:color w:val="282360"/>
           <w:sz w:val="26"/>
           <w:szCs w:val="26"/>
           <w:rtl/>
@@ -24370,7 +24065,6 @@
       <w:r>
         <w:rPr>
           <w:rFonts w:hint="cs"/>
-          <w:color w:val="282360"/>
           <w:sz w:val="26"/>
           <w:szCs w:val="26"/>
           <w:rtl/>
@@ -24379,7 +24073,6 @@
       </w:r>
       <w:r>
         <w:rPr>
-          <w:color w:val="282360"/>
           <w:sz w:val="26"/>
           <w:szCs w:val="26"/>
           <w:rtl/>
@@ -24389,7 +24082,6 @@
       <w:r>
         <w:rPr>
           <w:rFonts w:hint="cs"/>
-          <w:color w:val="282360"/>
           <w:sz w:val="26"/>
           <w:szCs w:val="26"/>
           <w:rtl/>
@@ -24398,7 +24090,6 @@
       </w:r>
       <w:r>
         <w:rPr>
-          <w:color w:val="282360"/>
           <w:sz w:val="26"/>
           <w:szCs w:val="26"/>
           <w:rtl/>
@@ -25819,13 +25510,8 @@
       <w:pPr>
         <w:keepNext/>
         <w:keepLines/>
-        <w:pBdr>
-          <w:top w:val="single" w:sz="7" w:space="8" w:color="F0C45F"/>
-          <w:right w:val="single" w:sz="7" w:space="8" w:color="F0C45F"/>
-          <w:left w:val="single" w:sz="7" w:space="8" w:color="F0C45F"/>
-        </w:pBdr>
-        <w:shd w:val="clear" w:color="auto" w:fill="FFF8E7"/>
-        <w:spacing w:line="280" w:lineRule="auto" w:before="80" w:after="80"/>
+        <w:pageBreakBefore/>
+        <w:spacing w:line="223" w:lineRule="auto"/>
         <w:ind w:left="567" w:hanging="567"/>
         <w:jc w:val="both"/>
       </w:pPr>
@@ -25833,7 +25519,6 @@
         <w:rPr>
           <w:b/>
           <w:bCs/>
-          <w:color w:val="282360"/>
           <w:rtl/>
         </w:rPr>
         <w:t>۳۱-</w:t>
@@ -25842,7 +25527,6 @@
         <w:rPr>
           <w:b/>
           <w:bCs/>
-          <w:color w:val="282360"/>
           <w:rtl/>
         </w:rPr>
         <w:tab/>
@@ -25853,14 +25537,12 @@
       <w:pPr>
         <w:keepNext/>
         <w:keepLines/>
-        <w:shd w:val="clear" w:color="auto" w:fill="FFF8E7"/>
-        <w:spacing w:line="223" w:lineRule="auto" w:after="65"/>
+        <w:spacing w:line="223" w:lineRule="auto"/>
         <w:ind w:left="837" w:hanging="270"/>
         <w:jc w:val="both"/>
       </w:pPr>
       <w:r>
         <w:rPr>
-          <w:color w:val="282360"/>
           <w:sz w:val="26"/>
           <w:szCs w:val="26"/>
           <w:rtl/>
@@ -25869,7 +25551,6 @@
       </w:r>
       <w:r>
         <w:rPr>
-          <w:color w:val="282360"/>
           <w:sz w:val="26"/>
           <w:szCs w:val="26"/>
           <w:rtl/>
@@ -25882,14 +25563,12 @@
       <w:pPr>
         <w:keepNext/>
         <w:keepLines/>
-        <w:shd w:val="clear" w:color="auto" w:fill="FFF8E7"/>
-        <w:spacing w:line="223" w:lineRule="auto" w:after="65"/>
+        <w:spacing w:line="223" w:lineRule="auto"/>
         <w:ind w:left="837" w:hanging="270"/>
         <w:jc w:val="both"/>
       </w:pPr>
       <w:r>
         <w:rPr>
-          <w:color w:val="282360"/>
           <w:sz w:val="26"/>
           <w:szCs w:val="26"/>
           <w:rtl/>
@@ -25898,7 +25577,6 @@
       </w:r>
       <w:r>
         <w:rPr>
-          <w:color w:val="282360"/>
           <w:sz w:val="26"/>
           <w:szCs w:val="26"/>
           <w:rtl/>
@@ -25911,14 +25589,12 @@
       <w:pPr>
         <w:keepNext/>
         <w:keepLines/>
-        <w:shd w:val="clear" w:color="auto" w:fill="FFF8E7"/>
-        <w:spacing w:line="223" w:lineRule="auto" w:after="65"/>
+        <w:spacing w:line="223" w:lineRule="auto"/>
         <w:ind w:left="837" w:hanging="270"/>
         <w:jc w:val="both"/>
       </w:pPr>
       <w:r>
         <w:rPr>
-          <w:color w:val="282360"/>
           <w:sz w:val="26"/>
           <w:szCs w:val="26"/>
           <w:rtl/>
@@ -25927,7 +25603,6 @@
       </w:r>
       <w:r>
         <w:rPr>
-          <w:color w:val="282360"/>
           <w:sz w:val="26"/>
           <w:szCs w:val="26"/>
           <w:rtl/>
@@ -25938,10 +25613,8 @@
     </w:p>
     <w:p>
       <w:pPr>
-        <w:keepNext/>
         <w:keepLines/>
-        <w:shd w:val="clear" w:color="auto" w:fill="FFF8E7"/>
-        <w:spacing w:line="223" w:lineRule="auto" w:after="65"/>
+        <w:spacing w:line="223" w:lineRule="auto"/>
         <w:ind w:left="837" w:hanging="270"/>
         <w:jc w:val="both"/>
         <w:rPr>
@@ -25952,7 +25625,6 @@
       </w:pPr>
       <w:r>
         <w:rPr>
-          <w:color w:val="282360"/>
           <w:sz w:val="26"/>
           <w:szCs w:val="26"/>
           <w:rtl/>
@@ -25961,7 +25633,6 @@
       </w:r>
       <w:r>
         <w:rPr>
-          <w:color w:val="282360"/>
           <w:sz w:val="26"/>
           <w:szCs w:val="26"/>
           <w:rtl/>
@@ -28229,13 +27900,8 @@
       <w:pPr>
         <w:keepNext/>
         <w:keepLines/>
-        <w:pBdr>
-          <w:top w:val="single" w:sz="7" w:space="8" w:color="F0C45F"/>
-          <w:right w:val="single" w:sz="7" w:space="8" w:color="F0C45F"/>
-          <w:left w:val="single" w:sz="7" w:space="8" w:color="F0C45F"/>
-        </w:pBdr>
-        <w:shd w:val="clear" w:color="auto" w:fill="FFF8E7"/>
-        <w:spacing w:line="280" w:lineRule="auto" w:before="80" w:after="80"/>
+        <w:pageBreakBefore/>
+        <w:spacing w:line="223" w:lineRule="auto"/>
         <w:ind w:left="567" w:hanging="567"/>
         <w:jc w:val="both"/>
       </w:pPr>
@@ -28243,7 +27909,6 @@
         <w:rPr>
           <w:b/>
           <w:bCs/>
-          <w:color w:val="282360"/>
           <w:rtl/>
         </w:rPr>
         <w:t>۳۲-</w:t>
@@ -28252,7 +27917,6 @@
         <w:rPr>
           <w:b/>
           <w:bCs/>
-          <w:color w:val="282360"/>
           <w:rtl/>
         </w:rPr>
         <w:tab/>
@@ -28263,7 +27927,6 @@
           <w:rFonts w:hint="cs"/>
           <w:b/>
           <w:bCs/>
-          <w:color w:val="282360"/>
           <w:rtl/>
         </w:rPr>
         <w:t xml:space="preserve">برای تکمیل عبارت زیر </w:t>
@@ -28273,7 +27936,6 @@
           <w:rFonts w:hint="cs"/>
           <w:b/>
           <w:bCs/>
-          <w:color w:val="282360"/>
           <w:u w:val="single"/>
           <w:rtl/>
         </w:rPr>
@@ -28284,7 +27946,6 @@
           <w:rFonts w:hint="cs"/>
           <w:b/>
           <w:bCs/>
-          <w:color w:val="282360"/>
           <w:rtl/>
         </w:rPr>
         <w:t xml:space="preserve"> است؟</w:t>
@@ -28294,8 +27955,7 @@
       <w:pPr>
         <w:keepNext/>
         <w:keepLines/>
-        <w:shd w:val="clear" w:color="auto" w:fill="FFF8E7"/>
-        <w:spacing w:line="223" w:lineRule="auto" w:after="65"/>
+        <w:spacing w:line="223" w:lineRule="auto"/>
         <w:ind w:left="567"/>
         <w:jc w:val="both"/>
       </w:pPr>
@@ -28303,7 +27963,6 @@
         <w:rPr>
           <w:b/>
           <w:bCs/>
-          <w:color w:val="282360"/>
           <w:rtl/>
         </w:rPr>
         <w:t>«در مرحلهٔ .................. دستگاه گوارش، ممکن است .................. .»</w:t>
@@ -28313,14 +27972,12 @@
       <w:pPr>
         <w:keepNext/>
         <w:keepLines/>
-        <w:shd w:val="clear" w:color="auto" w:fill="FFF8E7"/>
-        <w:spacing w:line="223" w:lineRule="auto" w:after="65"/>
+        <w:spacing w:line="223" w:lineRule="auto"/>
         <w:ind w:left="837" w:hanging="270"/>
         <w:jc w:val="both"/>
       </w:pPr>
       <w:r>
         <w:rPr>
-          <w:color w:val="282360"/>
           <w:sz w:val="26"/>
           <w:szCs w:val="26"/>
           <w:rtl/>
@@ -28329,7 +27986,6 @@
       </w:r>
       <w:r>
         <w:rPr>
-          <w:color w:val="282360"/>
           <w:sz w:val="26"/>
           <w:szCs w:val="26"/>
           <w:rtl/>
@@ -28340,7 +27996,6 @@
       <w:r>
         <w:rPr>
           <w:rFonts w:hint="cs"/>
-          <w:color w:val="282360"/>
           <w:sz w:val="26"/>
           <w:szCs w:val="26"/>
           <w:rtl/>
@@ -28349,7 +28004,6 @@
       </w:r>
       <w:r>
         <w:rPr>
-          <w:color w:val="282360"/>
           <w:sz w:val="26"/>
           <w:szCs w:val="26"/>
           <w:rtl/>
@@ -28359,7 +28013,6 @@
       <w:r>
         <w:rPr>
           <w:rFonts w:hint="cs"/>
-          <w:color w:val="282360"/>
           <w:sz w:val="26"/>
           <w:szCs w:val="26"/>
           <w:rtl/>
@@ -28368,7 +28021,6 @@
       </w:r>
       <w:r>
         <w:rPr>
-          <w:color w:val="282360"/>
           <w:sz w:val="26"/>
           <w:szCs w:val="26"/>
           <w:rtl/>
@@ -28378,7 +28030,6 @@
       <w:r>
         <w:rPr>
           <w:rFonts w:hint="cs"/>
-          <w:color w:val="282360"/>
           <w:sz w:val="26"/>
           <w:szCs w:val="26"/>
           <w:rtl/>
@@ -28390,14 +28041,12 @@
       <w:pPr>
         <w:keepNext/>
         <w:keepLines/>
-        <w:shd w:val="clear" w:color="auto" w:fill="FFF8E7"/>
-        <w:spacing w:line="223" w:lineRule="auto" w:after="65"/>
+        <w:spacing w:line="223" w:lineRule="auto"/>
         <w:ind w:left="837" w:hanging="270"/>
         <w:jc w:val="both"/>
       </w:pPr>
       <w:r>
         <w:rPr>
-          <w:color w:val="282360"/>
           <w:sz w:val="26"/>
           <w:szCs w:val="26"/>
           <w:rtl/>
@@ -28406,7 +28055,6 @@
       </w:r>
       <w:r>
         <w:rPr>
-          <w:color w:val="282360"/>
           <w:sz w:val="26"/>
           <w:szCs w:val="26"/>
           <w:rtl/>
@@ -28417,7 +28065,6 @@
       <w:r>
         <w:rPr>
           <w:rFonts w:hint="cs"/>
-          <w:color w:val="282360"/>
           <w:sz w:val="26"/>
           <w:szCs w:val="26"/>
           <w:rtl/>
@@ -28426,7 +28073,6 @@
       </w:r>
       <w:r>
         <w:rPr>
-          <w:color w:val="282360"/>
           <w:sz w:val="26"/>
           <w:szCs w:val="26"/>
           <w:rtl/>
@@ -28436,7 +28082,6 @@
       <w:r>
         <w:rPr>
           <w:rFonts w:hint="cs"/>
-          <w:color w:val="282360"/>
           <w:sz w:val="26"/>
           <w:szCs w:val="26"/>
           <w:rtl/>
@@ -28445,7 +28090,6 @@
       </w:r>
       <w:r>
         <w:rPr>
-          <w:color w:val="282360"/>
           <w:sz w:val="26"/>
           <w:szCs w:val="26"/>
           <w:rtl/>
@@ -28455,7 +28099,6 @@
       <w:r>
         <w:rPr>
           <w:rFonts w:hint="cs"/>
-          <w:color w:val="282360"/>
           <w:sz w:val="26"/>
           <w:szCs w:val="26"/>
           <w:rtl/>
@@ -28467,14 +28110,12 @@
       <w:pPr>
         <w:keepNext/>
         <w:keepLines/>
-        <w:shd w:val="clear" w:color="auto" w:fill="FFF8E7"/>
-        <w:spacing w:line="223" w:lineRule="auto" w:after="65"/>
+        <w:spacing w:line="223" w:lineRule="auto"/>
         <w:ind w:left="837" w:hanging="270"/>
         <w:jc w:val="both"/>
       </w:pPr>
       <w:r>
         <w:rPr>
-          <w:color w:val="282360"/>
           <w:sz w:val="26"/>
           <w:szCs w:val="26"/>
           <w:rtl/>
@@ -28483,7 +28124,6 @@
       </w:r>
       <w:r>
         <w:rPr>
-          <w:color w:val="282360"/>
           <w:sz w:val="26"/>
           <w:szCs w:val="26"/>
           <w:rtl/>
@@ -28494,7 +28134,6 @@
       <w:r>
         <w:rPr>
           <w:rFonts w:hint="cs"/>
-          <w:color w:val="282360"/>
           <w:sz w:val="26"/>
           <w:szCs w:val="26"/>
           <w:rtl/>
@@ -28503,7 +28142,6 @@
       </w:r>
       <w:r>
         <w:rPr>
-          <w:color w:val="282360"/>
           <w:sz w:val="26"/>
           <w:szCs w:val="26"/>
           <w:rtl/>
@@ -28513,7 +28151,6 @@
       <w:r>
         <w:rPr>
           <w:rFonts w:hint="cs"/>
-          <w:color w:val="282360"/>
           <w:sz w:val="26"/>
           <w:szCs w:val="26"/>
           <w:rtl/>
@@ -28522,7 +28159,6 @@
       </w:r>
       <w:r>
         <w:rPr>
-          <w:color w:val="282360"/>
           <w:sz w:val="26"/>
           <w:szCs w:val="26"/>
           <w:rtl/>
@@ -28532,7 +28168,6 @@
       <w:r>
         <w:rPr>
           <w:rFonts w:hint="cs"/>
-          <w:color w:val="282360"/>
           <w:sz w:val="26"/>
           <w:szCs w:val="26"/>
           <w:rtl/>
@@ -28542,10 +28177,8 @@
     </w:p>
     <w:p>
       <w:pPr>
-        <w:keepNext/>
         <w:keepLines/>
-        <w:shd w:val="clear" w:color="auto" w:fill="FFF8E7"/>
-        <w:spacing w:line="223" w:lineRule="auto" w:after="65"/>
+        <w:spacing w:line="223" w:lineRule="auto"/>
         <w:ind w:left="837" w:hanging="270"/>
         <w:jc w:val="both"/>
         <w:rPr>
@@ -28554,7 +28187,6 @@
       </w:pPr>
       <w:r>
         <w:rPr>
-          <w:color w:val="282360"/>
           <w:sz w:val="26"/>
           <w:szCs w:val="26"/>
           <w:rtl/>
@@ -28563,7 +28195,6 @@
       </w:r>
       <w:r>
         <w:rPr>
-          <w:color w:val="282360"/>
           <w:sz w:val="26"/>
           <w:szCs w:val="26"/>
           <w:rtl/>
@@ -28574,7 +28205,6 @@
       <w:r>
         <w:rPr>
           <w:rFonts w:hint="cs"/>
-          <w:color w:val="282360"/>
           <w:sz w:val="26"/>
           <w:szCs w:val="26"/>
           <w:rtl/>
@@ -28583,7 +28213,6 @@
       </w:r>
       <w:r>
         <w:rPr>
-          <w:color w:val="282360"/>
           <w:sz w:val="26"/>
           <w:szCs w:val="26"/>
           <w:rtl/>
@@ -28593,7 +28222,6 @@
       <w:r>
         <w:rPr>
           <w:rFonts w:hint="cs"/>
-          <w:color w:val="282360"/>
           <w:sz w:val="26"/>
           <w:szCs w:val="26"/>
           <w:rtl/>
@@ -28602,7 +28230,6 @@
       </w:r>
       <w:r>
         <w:rPr>
-          <w:color w:val="282360"/>
           <w:sz w:val="26"/>
           <w:szCs w:val="26"/>
           <w:rtl/>
@@ -28612,7 +28239,6 @@
       <w:r>
         <w:rPr>
           <w:rFonts w:hint="cs"/>
-          <w:color w:val="282360"/>
           <w:sz w:val="26"/>
           <w:szCs w:val="26"/>
           <w:rtl/>
@@ -30842,13 +30468,8 @@
       <w:pPr>
         <w:keepNext/>
         <w:keepLines/>
-        <w:pBdr>
-          <w:top w:val="single" w:sz="7" w:space="8" w:color="F0C45F"/>
-          <w:right w:val="single" w:sz="7" w:space="8" w:color="F0C45F"/>
-          <w:left w:val="single" w:sz="7" w:space="8" w:color="F0C45F"/>
-        </w:pBdr>
-        <w:shd w:val="clear" w:color="auto" w:fill="FFF8E7"/>
-        <w:spacing w:line="280" w:lineRule="auto" w:before="80" w:after="80"/>
+        <w:pageBreakBefore/>
+        <w:spacing w:line="223" w:lineRule="auto"/>
         <w:ind w:left="567" w:hanging="567"/>
         <w:jc w:val="both"/>
       </w:pPr>
@@ -30856,7 +30477,6 @@
         <w:rPr>
           <w:b/>
           <w:bCs/>
-          <w:color w:val="282360"/>
           <w:rtl/>
         </w:rPr>
         <w:t>۳۳-</w:t>
@@ -30865,7 +30485,6 @@
         <w:rPr>
           <w:b/>
           <w:bCs/>
-          <w:color w:val="282360"/>
           <w:rtl/>
         </w:rPr>
         <w:tab/>
@@ -30875,7 +30494,6 @@
         <w:rPr>
           <w:b/>
           <w:bCs/>
-          <w:color w:val="282360"/>
           <w:u w:val="single"/>
           <w:rtl/>
         </w:rPr>
@@ -30885,7 +30503,6 @@
         <w:rPr>
           <w:b/>
           <w:bCs/>
-          <w:color w:val="282360"/>
           <w:rtl/>
         </w:rPr>
         <w:t xml:space="preserve"> است؟</w:t>
@@ -30895,14 +30512,12 @@
       <w:pPr>
         <w:keepNext/>
         <w:keepLines/>
-        <w:shd w:val="clear" w:color="auto" w:fill="FFF8E7"/>
-        <w:spacing w:line="223" w:lineRule="auto" w:after="65"/>
+        <w:spacing w:line="223" w:lineRule="auto"/>
         <w:ind w:left="837" w:hanging="270"/>
         <w:jc w:val="both"/>
       </w:pPr>
       <w:r>
         <w:rPr>
-          <w:color w:val="282360"/>
           <w:sz w:val="26"/>
           <w:szCs w:val="26"/>
           <w:rtl/>
@@ -30911,7 +30526,6 @@
       </w:r>
       <w:r>
         <w:rPr>
-          <w:color w:val="282360"/>
           <w:sz w:val="26"/>
           <w:szCs w:val="26"/>
           <w:rtl/>
@@ -30924,14 +30538,12 @@
       <w:pPr>
         <w:keepNext/>
         <w:keepLines/>
-        <w:shd w:val="clear" w:color="auto" w:fill="FFF8E7"/>
-        <w:spacing w:line="223" w:lineRule="auto" w:after="65"/>
+        <w:spacing w:line="223" w:lineRule="auto"/>
         <w:ind w:left="837" w:hanging="270"/>
         <w:jc w:val="both"/>
       </w:pPr>
       <w:r>
         <w:rPr>
-          <w:color w:val="282360"/>
           <w:sz w:val="26"/>
           <w:szCs w:val="26"/>
           <w:rtl/>
@@ -30940,7 +30552,6 @@
       </w:r>
       <w:r>
         <w:rPr>
-          <w:color w:val="282360"/>
           <w:sz w:val="26"/>
           <w:szCs w:val="26"/>
           <w:rtl/>
@@ -30953,14 +30564,12 @@
       <w:pPr>
         <w:keepNext/>
         <w:keepLines/>
-        <w:shd w:val="clear" w:color="auto" w:fill="FFF8E7"/>
-        <w:spacing w:line="223" w:lineRule="auto" w:after="65"/>
+        <w:spacing w:line="223" w:lineRule="auto"/>
         <w:ind w:left="837" w:hanging="270"/>
         <w:jc w:val="both"/>
       </w:pPr>
       <w:r>
         <w:rPr>
-          <w:color w:val="282360"/>
           <w:sz w:val="26"/>
           <w:szCs w:val="26"/>
           <w:rtl/>
@@ -30969,7 +30578,6 @@
       </w:r>
       <w:r>
         <w:rPr>
-          <w:color w:val="282360"/>
           <w:sz w:val="26"/>
           <w:szCs w:val="26"/>
           <w:rtl/>
@@ -30980,10 +30588,8 @@
     </w:p>
     <w:p>
       <w:pPr>
-        <w:keepNext/>
         <w:keepLines/>
-        <w:shd w:val="clear" w:color="auto" w:fill="FFF8E7"/>
-        <w:spacing w:line="223" w:lineRule="auto" w:after="65"/>
+        <w:spacing w:line="223" w:lineRule="auto"/>
         <w:ind w:left="837" w:hanging="270"/>
         <w:jc w:val="both"/>
         <w:rPr>
@@ -30992,7 +30598,6 @@
       </w:pPr>
       <w:r>
         <w:rPr>
-          <w:color w:val="282360"/>
           <w:sz w:val="26"/>
           <w:szCs w:val="26"/>
           <w:rtl/>
@@ -31001,7 +30606,6 @@
       </w:r>
       <w:r>
         <w:rPr>
-          <w:color w:val="282360"/>
           <w:sz w:val="26"/>
           <w:szCs w:val="26"/>
           <w:rtl/>
@@ -33021,13 +32625,8 @@
       <w:pPr>
         <w:keepNext/>
         <w:keepLines/>
-        <w:pBdr>
-          <w:top w:val="single" w:sz="7" w:space="8" w:color="F0C45F"/>
-          <w:right w:val="single" w:sz="7" w:space="8" w:color="F0C45F"/>
-          <w:left w:val="single" w:sz="7" w:space="8" w:color="F0C45F"/>
-        </w:pBdr>
-        <w:shd w:val="clear" w:color="auto" w:fill="FFF8E7"/>
-        <w:spacing w:line="280" w:lineRule="auto" w:before="80" w:after="80"/>
+        <w:pageBreakBefore/>
+        <w:spacing w:line="223" w:lineRule="auto"/>
         <w:ind w:left="567" w:hanging="567"/>
         <w:jc w:val="both"/>
       </w:pPr>
@@ -33035,7 +32634,6 @@
         <w:rPr>
           <w:b/>
           <w:bCs/>
-          <w:color w:val="282360"/>
           <w:rtl/>
         </w:rPr>
         <w:t>۳۴-</w:t>
@@ -33044,7 +32642,6 @@
         <w:rPr>
           <w:b/>
           <w:bCs/>
-          <w:color w:val="282360"/>
           <w:rtl/>
         </w:rPr>
         <w:tab/>
@@ -33055,8 +32652,7 @@
       <w:pPr>
         <w:keepNext/>
         <w:keepLines/>
-        <w:shd w:val="clear" w:color="auto" w:fill="FFF8E7"/>
-        <w:spacing w:line="223" w:lineRule="auto" w:after="65"/>
+        <w:spacing w:line="223" w:lineRule="auto"/>
         <w:ind w:left="567"/>
         <w:jc w:val="both"/>
       </w:pPr>
@@ -33064,7 +32660,6 @@
         <w:rPr>
           <w:b/>
           <w:bCs/>
-          <w:color w:val="282360"/>
           <w:rtl/>
         </w:rPr>
         <w:t xml:space="preserve">الف: </w:t>
@@ -33074,7 +32669,6 @@
           <w:rFonts w:hint="cs"/>
           <w:b/>
           <w:bCs/>
-          <w:color w:val="282360"/>
           <w:rtl/>
         </w:rPr>
         <w:t>فعالیت نوعی آنزیم گوارشی درون فضای داخلی آن</w:t>
@@ -33084,8 +32678,7 @@
       <w:pPr>
         <w:keepNext/>
         <w:keepLines/>
-        <w:shd w:val="clear" w:color="auto" w:fill="FFF8E7"/>
-        <w:spacing w:line="223" w:lineRule="auto" w:after="65"/>
+        <w:spacing w:line="223" w:lineRule="auto"/>
         <w:ind w:left="567"/>
         <w:jc w:val="both"/>
       </w:pPr>
@@ -33093,7 +32686,6 @@
         <w:rPr>
           <w:b/>
           <w:bCs/>
-          <w:color w:val="282360"/>
           <w:rtl/>
         </w:rPr>
         <w:t>ب: مجاورت با پردهٔ اتصال‌دهندهٔ اندام‌های درون شکم</w:t>
@@ -33103,8 +32695,7 @@
       <w:pPr>
         <w:keepNext/>
         <w:keepLines/>
-        <w:shd w:val="clear" w:color="auto" w:fill="FFF8E7"/>
-        <w:spacing w:line="223" w:lineRule="auto" w:after="65"/>
+        <w:spacing w:line="223" w:lineRule="auto"/>
         <w:ind w:left="567"/>
         <w:jc w:val="both"/>
       </w:pPr>
@@ -33112,7 +32703,6 @@
         <w:rPr>
           <w:b/>
           <w:bCs/>
-          <w:color w:val="282360"/>
           <w:rtl/>
         </w:rPr>
         <w:t>ج: داشتن نوعی بافت با مادهٔ زمینه‌ای چسبنده</w:t>
@@ -33122,8 +32712,7 @@
       <w:pPr>
         <w:keepNext/>
         <w:keepLines/>
-        <w:shd w:val="clear" w:color="auto" w:fill="FFF8E7"/>
-        <w:spacing w:line="223" w:lineRule="auto" w:after="65"/>
+        <w:spacing w:line="223" w:lineRule="auto"/>
         <w:ind w:left="567"/>
         <w:jc w:val="both"/>
       </w:pPr>
@@ -33131,7 +32720,6 @@
         <w:rPr>
           <w:b/>
           <w:bCs/>
-          <w:color w:val="282360"/>
           <w:rtl/>
         </w:rPr>
         <w:t>د: سازمان یافتن در چهار لایه</w:t>
@@ -33142,19 +32730,17 @@
         <w:bidiVisual/>
         <w:tblW w:w="9772" w:type="dxa"/>
         <w:tblBorders>
-          <w:top w:val="single" w:sz="4" w:space="0" w:color="F0C45F"/>
-          <w:left w:val="single" w:sz="4" w:space="0" w:color="F0C45F"/>
-          <w:bottom w:val="single" w:sz="4" w:space="0" w:color="F0C45F"/>
-          <w:right w:val="single" w:sz="4" w:space="0" w:color="F0C45F"/>
-          <w:insideH w:val="single" w:sz="4" w:space="0" w:color="F0C45F"/>
-          <w:insideV w:val="single" w:sz="4" w:space="0" w:color="F0C45F"/>
+          <w:top w:val="nil"/>
+          <w:left w:val="nil"/>
+          <w:bottom w:val="nil"/>
+          <w:right w:val="nil"/>
+          <w:insideH w:val="nil"/>
+          <w:insideV w:val="nil"/>
         </w:tblBorders>
         <w:tblLayout w:type="fixed"/>
         <w:tblCellMar>
-          <w:top w:w="85" w:type="dxa"/>
-          <w:left w:w="100" w:type="dxa"/>
-          <w:bottom w:w="85" w:type="dxa"/>
-          <w:right w:w="100" w:type="dxa"/>
+          <w:left w:w="0" w:type="dxa"/>
+          <w:right w:w="0" w:type="dxa"/>
         </w:tblCellMar>
         <w:tblLook w:val="04A0" w:firstRow="1" w:lastRow="0" w:firstColumn="1" w:lastColumn="0" w:noHBand="0" w:noVBand="1"/>
       </w:tblPr>
@@ -33171,8 +32757,6 @@
         <w:tc>
           <w:tcPr>
             <w:tcW w:w="2868" w:type="dxa"/>
-            <w:shd w:val="clear" w:color="auto" w:fill="FFF8E7"/>
-            <w:vAlign w:val="center"/>
           </w:tcPr>
           <w:p>
             <w:pPr>
@@ -33182,7 +32766,6 @@
             </w:pPr>
             <w:r>
               <w:rPr>
-                <w:color w:val="282360"/>
                 <w:sz w:val="26"/>
                 <w:szCs w:val="26"/>
                 <w:rtl/>
@@ -33194,8 +32777,6 @@
         <w:tc>
           <w:tcPr>
             <w:tcW w:w="2301" w:type="dxa"/>
-            <w:shd w:val="clear" w:color="auto" w:fill="FFF8E7"/>
-            <w:vAlign w:val="center"/>
           </w:tcPr>
           <w:p>
             <w:pPr>
@@ -33204,7 +32785,6 @@
             </w:pPr>
             <w:r>
               <w:rPr>
-                <w:color w:val="282360"/>
                 <w:sz w:val="26"/>
                 <w:szCs w:val="26"/>
                 <w:rtl/>
@@ -33216,8 +32796,6 @@
         <w:tc>
           <w:tcPr>
             <w:tcW w:w="2301" w:type="dxa"/>
-            <w:shd w:val="clear" w:color="auto" w:fill="FFF8E7"/>
-            <w:vAlign w:val="center"/>
           </w:tcPr>
           <w:p>
             <w:pPr>
@@ -33226,7 +32804,6 @@
             </w:pPr>
             <w:r>
               <w:rPr>
-                <w:color w:val="282360"/>
                 <w:sz w:val="26"/>
                 <w:szCs w:val="26"/>
                 <w:rtl/>
@@ -33238,8 +32815,6 @@
         <w:tc>
           <w:tcPr>
             <w:tcW w:w="2302" w:type="dxa"/>
-            <w:shd w:val="clear" w:color="auto" w:fill="FFF8E7"/>
-            <w:vAlign w:val="center"/>
           </w:tcPr>
           <w:p>
             <w:pPr>
@@ -33251,7 +32826,6 @@
             </w:pPr>
             <w:r>
               <w:rPr>
-                <w:color w:val="282360"/>
                 <w:sz w:val="26"/>
                 <w:szCs w:val="26"/>
                 <w:rtl/>
@@ -35721,13 +35295,8 @@
       <w:pPr>
         <w:keepNext/>
         <w:keepLines/>
-        <w:pBdr>
-          <w:top w:val="single" w:sz="7" w:space="8" w:color="F0C45F"/>
-          <w:right w:val="single" w:sz="7" w:space="8" w:color="F0C45F"/>
-          <w:left w:val="single" w:sz="7" w:space="8" w:color="F0C45F"/>
-        </w:pBdr>
-        <w:shd w:val="clear" w:color="auto" w:fill="FFF8E7"/>
-        <w:spacing w:line="280" w:lineRule="auto" w:before="80" w:after="80"/>
+        <w:pageBreakBefore/>
+        <w:spacing w:line="223" w:lineRule="auto"/>
         <w:ind w:left="567" w:hanging="567"/>
         <w:jc w:val="both"/>
       </w:pPr>
@@ -35736,7 +35305,6 @@
           <w:rFonts w:hint="cs"/>
           <w:b/>
           <w:bCs/>
-          <w:color w:val="282360"/>
           <w:rtl/>
         </w:rPr>
         <w:t>۳۵</w:t>
@@ -35745,7 +35313,6 @@
         <w:rPr>
           <w:b/>
           <w:bCs/>
-          <w:color w:val="282360"/>
           <w:rtl/>
         </w:rPr>
         <w:t>-</w:t>
@@ -35754,7 +35321,6 @@
         <w:rPr>
           <w:b/>
           <w:bCs/>
-          <w:color w:val="282360"/>
           <w:rtl/>
         </w:rPr>
         <w:tab/>
@@ -35764,7 +35330,6 @@
         <w:rPr>
           <w:b/>
           <w:bCs/>
-          <w:color w:val="282360"/>
           <w:u w:val="single"/>
           <w:rtl/>
         </w:rPr>
@@ -35774,7 +35339,6 @@
         <w:rPr>
           <w:b/>
           <w:bCs/>
-          <w:color w:val="282360"/>
           <w:rtl/>
         </w:rPr>
         <w:t xml:space="preserve"> است؟</w:t>
@@ -35784,14 +35348,12 @@
       <w:pPr>
         <w:keepNext/>
         <w:keepLines/>
-        <w:shd w:val="clear" w:color="auto" w:fill="FFF8E7"/>
-        <w:spacing w:line="223" w:lineRule="auto" w:after="65"/>
+        <w:spacing w:line="223" w:lineRule="auto"/>
         <w:ind w:left="837" w:hanging="270"/>
         <w:jc w:val="both"/>
       </w:pPr>
       <w:r>
         <w:rPr>
-          <w:color w:val="282360"/>
           <w:sz w:val="26"/>
           <w:szCs w:val="26"/>
           <w:rtl/>
@@ -35800,7 +35362,6 @@
       </w:r>
       <w:r>
         <w:rPr>
-          <w:color w:val="282360"/>
           <w:sz w:val="26"/>
           <w:szCs w:val="26"/>
           <w:rtl/>
@@ -35813,14 +35374,12 @@
       <w:pPr>
         <w:keepNext/>
         <w:keepLines/>
-        <w:shd w:val="clear" w:color="auto" w:fill="FFF8E7"/>
-        <w:spacing w:line="223" w:lineRule="auto" w:after="65"/>
+        <w:spacing w:line="223" w:lineRule="auto"/>
         <w:ind w:left="837" w:hanging="270"/>
         <w:jc w:val="both"/>
       </w:pPr>
       <w:r>
         <w:rPr>
-          <w:color w:val="282360"/>
           <w:sz w:val="26"/>
           <w:szCs w:val="26"/>
           <w:rtl/>
@@ -35829,7 +35388,6 @@
       </w:r>
       <w:r>
         <w:rPr>
-          <w:color w:val="282360"/>
           <w:sz w:val="26"/>
           <w:szCs w:val="26"/>
           <w:rtl/>
@@ -35842,14 +35400,12 @@
       <w:pPr>
         <w:keepNext/>
         <w:keepLines/>
-        <w:shd w:val="clear" w:color="auto" w:fill="FFF8E7"/>
-        <w:spacing w:line="223" w:lineRule="auto" w:after="65"/>
+        <w:spacing w:line="223" w:lineRule="auto"/>
         <w:ind w:left="837" w:hanging="270"/>
         <w:jc w:val="both"/>
       </w:pPr>
       <w:r>
         <w:rPr>
-          <w:color w:val="282360"/>
           <w:sz w:val="26"/>
           <w:szCs w:val="26"/>
           <w:rtl/>
@@ -35858,7 +35414,6 @@
       </w:r>
       <w:r>
         <w:rPr>
-          <w:color w:val="282360"/>
           <w:sz w:val="26"/>
           <w:szCs w:val="26"/>
           <w:rtl/>
@@ -35869,10 +35424,8 @@
     </w:p>
     <w:p>
       <w:pPr>
-        <w:keepNext/>
         <w:keepLines/>
-        <w:shd w:val="clear" w:color="auto" w:fill="FFF8E7"/>
-        <w:spacing w:line="223" w:lineRule="auto" w:after="65"/>
+        <w:spacing w:line="223" w:lineRule="auto"/>
         <w:ind w:left="837" w:hanging="270"/>
         <w:jc w:val="both"/>
         <w:rPr>
@@ -35881,7 +35434,6 @@
       </w:pPr>
       <w:r>
         <w:rPr>
-          <w:color w:val="282360"/>
           <w:sz w:val="26"/>
           <w:szCs w:val="26"/>
           <w:rtl/>
@@ -35890,7 +35442,6 @@
       </w:r>
       <w:r>
         <w:rPr>
-          <w:color w:val="282360"/>
           <w:sz w:val="26"/>
           <w:szCs w:val="26"/>
           <w:rtl/>
@@ -35901,7 +35452,6 @@
       <w:r>
         <w:rPr>
           <w:rFonts w:hint="cs"/>
-          <w:color w:val="282360"/>
           <w:sz w:val="26"/>
           <w:szCs w:val="26"/>
           <w:rtl/>
@@ -35910,7 +35460,6 @@
       </w:r>
       <w:r>
         <w:rPr>
-          <w:color w:val="282360"/>
           <w:sz w:val="26"/>
           <w:szCs w:val="26"/>
           <w:rtl/>
@@ -38148,13 +37697,8 @@
       <w:pPr>
         <w:keepNext/>
         <w:keepLines/>
-        <w:pBdr>
-          <w:top w:val="single" w:sz="7" w:space="8" w:color="F0C45F"/>
-          <w:right w:val="single" w:sz="7" w:space="8" w:color="F0C45F"/>
-          <w:left w:val="single" w:sz="7" w:space="8" w:color="F0C45F"/>
-        </w:pBdr>
-        <w:shd w:val="clear" w:color="auto" w:fill="FFF8E7"/>
-        <w:spacing w:line="280" w:lineRule="auto" w:before="80" w:after="80"/>
+        <w:pageBreakBefore/>
+        <w:spacing w:line="223" w:lineRule="auto"/>
         <w:ind w:left="567" w:hanging="567"/>
         <w:jc w:val="both"/>
       </w:pPr>
@@ -38162,7 +37706,6 @@
         <w:rPr>
           <w:b/>
           <w:bCs/>
-          <w:color w:val="282360"/>
           <w:rtl/>
         </w:rPr>
         <w:t>۳۶-</w:t>
@@ -38171,7 +37714,6 @@
         <w:rPr>
           <w:b/>
           <w:bCs/>
-          <w:color w:val="282360"/>
           <w:rtl/>
         </w:rPr>
         <w:tab/>
@@ -38182,7 +37724,6 @@
           <w:rFonts w:hint="cs"/>
           <w:b/>
           <w:bCs/>
-          <w:color w:val="282360"/>
           <w:rtl/>
         </w:rPr>
         <w:t xml:space="preserve">ویژگی </w:t>
@@ -38191,7 +37732,6 @@
         <w:rPr>
           <w:b/>
           <w:bCs/>
-          <w:color w:val="282360"/>
           <w:rtl/>
         </w:rPr>
         <w:t xml:space="preserve">بزرگ‌ترین یاخته‌های غدهٔ معده </w:t>
@@ -38201,7 +37741,6 @@
           <w:rFonts w:hint="cs"/>
           <w:b/>
           <w:bCs/>
-          <w:color w:val="282360"/>
           <w:rtl/>
         </w:rPr>
         <w:t xml:space="preserve">را به درستی بیان </w:t>
@@ -38210,7 +37749,6 @@
         <w:rPr>
           <w:b/>
           <w:bCs/>
-          <w:color w:val="282360"/>
           <w:rtl/>
         </w:rPr>
         <w:t>می‌کند؟</w:t>
@@ -38220,14 +37758,12 @@
       <w:pPr>
         <w:keepNext/>
         <w:keepLines/>
-        <w:shd w:val="clear" w:color="auto" w:fill="FFF8E7"/>
-        <w:spacing w:line="223" w:lineRule="auto" w:after="65"/>
+        <w:spacing w:line="223" w:lineRule="auto"/>
         <w:ind w:left="837" w:hanging="270"/>
         <w:jc w:val="both"/>
       </w:pPr>
       <w:r>
         <w:rPr>
-          <w:color w:val="282360"/>
           <w:sz w:val="26"/>
           <w:szCs w:val="26"/>
           <w:rtl/>
@@ -38236,7 +37772,6 @@
       </w:r>
       <w:r>
         <w:rPr>
-          <w:color w:val="282360"/>
           <w:sz w:val="26"/>
           <w:szCs w:val="26"/>
           <w:rtl/>
@@ -38247,7 +37782,6 @@
       <w:r>
         <w:rPr>
           <w:rFonts w:hint="cs"/>
-          <w:color w:val="282360"/>
           <w:sz w:val="26"/>
           <w:szCs w:val="26"/>
           <w:rtl/>
@@ -38256,7 +37790,6 @@
       </w:r>
       <w:r>
         <w:rPr>
-          <w:color w:val="282360"/>
           <w:sz w:val="26"/>
           <w:szCs w:val="26"/>
           <w:rtl/>
@@ -38266,7 +37799,6 @@
       <w:r>
         <w:rPr>
           <w:rFonts w:hint="cs"/>
-          <w:color w:val="282360"/>
           <w:sz w:val="26"/>
           <w:szCs w:val="26"/>
           <w:rtl/>
@@ -38275,7 +37807,6 @@
       </w:r>
       <w:r>
         <w:rPr>
-          <w:color w:val="282360"/>
           <w:sz w:val="26"/>
           <w:szCs w:val="26"/>
           <w:rtl/>
@@ -38285,7 +37816,6 @@
       <w:r>
         <w:rPr>
           <w:rFonts w:hint="cs"/>
-          <w:color w:val="282360"/>
           <w:sz w:val="26"/>
           <w:szCs w:val="26"/>
           <w:rtl/>
@@ -38294,7 +37824,6 @@
       </w:r>
       <w:r>
         <w:rPr>
-          <w:color w:val="282360"/>
           <w:sz w:val="26"/>
           <w:szCs w:val="26"/>
           <w:rtl/>
@@ -38306,14 +37835,12 @@
       <w:pPr>
         <w:keepNext/>
         <w:keepLines/>
-        <w:shd w:val="clear" w:color="auto" w:fill="FFF8E7"/>
-        <w:spacing w:line="223" w:lineRule="auto" w:after="65"/>
+        <w:spacing w:line="223" w:lineRule="auto"/>
         <w:ind w:left="837" w:hanging="270"/>
         <w:jc w:val="both"/>
       </w:pPr>
       <w:r>
         <w:rPr>
-          <w:color w:val="282360"/>
           <w:sz w:val="26"/>
           <w:szCs w:val="26"/>
           <w:rtl/>
@@ -38322,7 +37849,6 @@
       </w:r>
       <w:r>
         <w:rPr>
-          <w:color w:val="282360"/>
           <w:sz w:val="26"/>
           <w:szCs w:val="26"/>
           <w:rtl/>
@@ -38335,14 +37861,12 @@
       <w:pPr>
         <w:keepNext/>
         <w:keepLines/>
-        <w:shd w:val="clear" w:color="auto" w:fill="FFF8E7"/>
-        <w:spacing w:line="223" w:lineRule="auto" w:after="65"/>
+        <w:spacing w:line="223" w:lineRule="auto"/>
         <w:ind w:left="837" w:hanging="270"/>
         <w:jc w:val="both"/>
       </w:pPr>
       <w:r>
         <w:rPr>
-          <w:color w:val="282360"/>
           <w:sz w:val="26"/>
           <w:szCs w:val="26"/>
           <w:rtl/>
@@ -38351,7 +37875,6 @@
       </w:r>
       <w:r>
         <w:rPr>
-          <w:color w:val="282360"/>
           <w:sz w:val="26"/>
           <w:szCs w:val="26"/>
           <w:rtl/>
@@ -38362,7 +37885,6 @@
       <w:r>
         <w:rPr>
           <w:rFonts w:hint="cs"/>
-          <w:color w:val="282360"/>
           <w:sz w:val="26"/>
           <w:szCs w:val="26"/>
           <w:rtl/>
@@ -38371,7 +37893,6 @@
       </w:r>
       <w:r>
         <w:rPr>
-          <w:color w:val="282360"/>
           <w:sz w:val="26"/>
           <w:szCs w:val="26"/>
           <w:rtl/>
@@ -38381,10 +37902,8 @@
     </w:p>
     <w:p>
       <w:pPr>
-        <w:keepNext/>
         <w:keepLines/>
-        <w:shd w:val="clear" w:color="auto" w:fill="FFF8E7"/>
-        <w:spacing w:line="223" w:lineRule="auto" w:after="65"/>
+        <w:spacing w:line="223" w:lineRule="auto"/>
         <w:ind w:left="837" w:hanging="270"/>
         <w:jc w:val="both"/>
         <w:rPr>
@@ -38393,7 +37912,6 @@
       </w:pPr>
       <w:r>
         <w:rPr>
-          <w:color w:val="282360"/>
           <w:sz w:val="26"/>
           <w:szCs w:val="26"/>
           <w:rtl/>
@@ -38402,7 +37920,6 @@
       </w:r>
       <w:r>
         <w:rPr>
-          <w:color w:val="282360"/>
           <w:sz w:val="26"/>
           <w:szCs w:val="26"/>
           <w:rtl/>
@@ -41083,13 +40600,8 @@
       <w:pPr>
         <w:keepNext/>
         <w:keepLines/>
-        <w:pBdr>
-          <w:top w:val="single" w:sz="7" w:space="8" w:color="F0C45F"/>
-          <w:right w:val="single" w:sz="7" w:space="8" w:color="F0C45F"/>
-          <w:left w:val="single" w:sz="7" w:space="8" w:color="F0C45F"/>
-        </w:pBdr>
-        <w:shd w:val="clear" w:color="auto" w:fill="FFF8E7"/>
-        <w:spacing w:line="280" w:lineRule="auto" w:before="80" w:after="80"/>
+        <w:pageBreakBefore/>
+        <w:spacing w:line="223" w:lineRule="auto"/>
         <w:ind w:left="567" w:hanging="567"/>
         <w:jc w:val="both"/>
       </w:pPr>
@@ -41098,7 +40610,6 @@
           <w:rFonts w:hint="cs"/>
           <w:b/>
           <w:bCs/>
-          <w:color w:val="282360"/>
           <w:rtl/>
         </w:rPr>
         <w:t>۳۷</w:t>
@@ -41107,7 +40618,6 @@
         <w:rPr>
           <w:b/>
           <w:bCs/>
-          <w:color w:val="282360"/>
           <w:rtl/>
         </w:rPr>
         <w:t>-</w:t>
@@ -41116,7 +40626,6 @@
         <w:rPr>
           <w:b/>
           <w:bCs/>
-          <w:color w:val="282360"/>
           <w:rtl/>
         </w:rPr>
         <w:tab/>
@@ -41126,7 +40635,6 @@
         <w:rPr>
           <w:b/>
           <w:bCs/>
-          <w:color w:val="282360"/>
           <w:u w:val="single"/>
           <w:rtl/>
         </w:rPr>
@@ -41136,7 +40644,6 @@
         <w:rPr>
           <w:b/>
           <w:bCs/>
-          <w:color w:val="282360"/>
           <w:rtl/>
         </w:rPr>
         <w:t xml:space="preserve"> است؟</w:t>
@@ -41147,19 +40654,17 @@
         <w:bidiVisual/>
         <w:tblW w:w="9772" w:type="dxa"/>
         <w:tblBorders>
-          <w:top w:val="single" w:sz="4" w:space="0" w:color="F0C45F"/>
-          <w:left w:val="single" w:sz="4" w:space="0" w:color="F0C45F"/>
-          <w:bottom w:val="single" w:sz="4" w:space="0" w:color="F0C45F"/>
-          <w:right w:val="single" w:sz="4" w:space="0" w:color="F0C45F"/>
-          <w:insideH w:val="single" w:sz="4" w:space="0" w:color="F0C45F"/>
-          <w:insideV w:val="single" w:sz="4" w:space="0" w:color="F0C45F"/>
+          <w:top w:val="nil"/>
+          <w:left w:val="nil"/>
+          <w:bottom w:val="nil"/>
+          <w:right w:val="nil"/>
+          <w:insideH w:val="nil"/>
+          <w:insideV w:val="nil"/>
         </w:tblBorders>
         <w:tblLayout w:type="fixed"/>
         <w:tblCellMar>
-          <w:top w:w="85" w:type="dxa"/>
-          <w:left w:w="100" w:type="dxa"/>
-          <w:bottom w:w="85" w:type="dxa"/>
-          <w:right w:w="100" w:type="dxa"/>
+          <w:left w:w="0" w:type="dxa"/>
+          <w:right w:w="0" w:type="dxa"/>
         </w:tblCellMar>
         <w:tblLook w:val="04A0" w:firstRow="1" w:lastRow="0" w:firstColumn="1" w:lastColumn="0" w:noHBand="0" w:noVBand="1"/>
       </w:tblPr>
@@ -41174,8 +40679,6 @@
         <w:tc>
           <w:tcPr>
             <w:tcW w:w="7092" w:type="dxa"/>
-            <w:shd w:val="clear" w:color="auto" w:fill="FFF8E7"/>
-            <w:vAlign w:val="center"/>
           </w:tcPr>
           <w:p>
             <w:pPr>
@@ -41187,7 +40690,6 @@
             </w:pPr>
             <w:r>
               <w:rPr>
-                <w:color w:val="282360"/>
                 <w:sz w:val="26"/>
                 <w:szCs w:val="26"/>
                 <w:rtl/>
@@ -41196,7 +40698,6 @@
             </w:r>
             <w:r>
               <w:rPr>
-                <w:color w:val="282360"/>
                 <w:sz w:val="26"/>
                 <w:szCs w:val="26"/>
                 <w:rtl/>
@@ -41207,7 +40708,6 @@
             <w:r>
               <w:rPr>
                 <w:rFonts w:hint="cs"/>
-                <w:color w:val="282360"/>
                 <w:sz w:val="26"/>
                 <w:szCs w:val="26"/>
                 <w:rtl/>
@@ -41216,7 +40716,6 @@
             </w:r>
             <w:r>
               <w:rPr>
-                <w:color w:val="282360"/>
                 <w:sz w:val="26"/>
                 <w:szCs w:val="26"/>
                 <w:rtl/>
@@ -41226,7 +40725,6 @@
             <w:r>
               <w:rPr>
                 <w:rFonts w:hint="cs"/>
-                <w:color w:val="282360"/>
                 <w:sz w:val="26"/>
                 <w:szCs w:val="26"/>
                 <w:rtl/>
@@ -41235,7 +40733,6 @@
             </w:r>
             <w:r>
               <w:rPr>
-                <w:color w:val="282360"/>
                 <w:sz w:val="26"/>
                 <w:szCs w:val="26"/>
                 <w:rtl/>
@@ -41253,7 +40750,6 @@
             </w:pPr>
             <w:r>
               <w:rPr>
-                <w:color w:val="282360"/>
                 <w:sz w:val="26"/>
                 <w:szCs w:val="26"/>
                 <w:rtl/>
@@ -41262,7 +40758,6 @@
             </w:r>
             <w:r>
               <w:rPr>
-                <w:color w:val="282360"/>
                 <w:sz w:val="26"/>
                 <w:szCs w:val="26"/>
                 <w:rtl/>
@@ -41281,7 +40776,6 @@
             </w:pPr>
             <w:r>
               <w:rPr>
-                <w:color w:val="282360"/>
                 <w:sz w:val="26"/>
                 <w:szCs w:val="26"/>
                 <w:rtl/>
@@ -41290,7 +40784,6 @@
             </w:r>
             <w:r>
               <w:rPr>
-                <w:color w:val="282360"/>
                 <w:sz w:val="26"/>
                 <w:szCs w:val="26"/>
                 <w:rtl/>
@@ -41312,7 +40805,6 @@
             </w:pPr>
             <w:r>
               <w:rPr>
-                <w:color w:val="282360"/>
                 <w:sz w:val="26"/>
                 <w:szCs w:val="26"/>
                 <w:rtl/>
@@ -41321,7 +40813,6 @@
             </w:r>
             <w:r>
               <w:rPr>
-                <w:color w:val="282360"/>
                 <w:sz w:val="26"/>
                 <w:szCs w:val="26"/>
                 <w:rtl/>
@@ -41334,8 +40825,6 @@
         <w:tc>
           <w:tcPr>
             <w:tcW w:w="2680" w:type="dxa"/>
-            <w:shd w:val="clear" w:color="auto" w:fill="FFF8E7"/>
-            <w:vAlign w:val="center"/>
           </w:tcPr>
           <w:p>
             <w:pPr>
@@ -41347,7 +40836,6 @@
             <w:r>
               <w:rPr>
                 <w:noProof/>
-                <w:color w:val="282360"/>
               </w:rPr>
               <w:drawing>
                 <wp:anchor distT="0" distB="0" distL="114300" distR="114300" simplePos="0" relativeHeight="251659264" behindDoc="1" locked="0" layoutInCell="1" allowOverlap="1" wp14:anchorId="37CC6C61" wp14:editId="3866994F">
@@ -43840,13 +43328,8 @@
       <w:pPr>
         <w:keepNext/>
         <w:keepLines/>
-        <w:pBdr>
-          <w:top w:val="single" w:sz="7" w:space="8" w:color="F0C45F"/>
-          <w:right w:val="single" w:sz="7" w:space="8" w:color="F0C45F"/>
-          <w:left w:val="single" w:sz="7" w:space="8" w:color="F0C45F"/>
-        </w:pBdr>
-        <w:shd w:val="clear" w:color="auto" w:fill="FFF8E7"/>
-        <w:spacing w:line="280" w:lineRule="auto" w:before="80" w:after="80"/>
+        <w:pageBreakBefore/>
+        <w:spacing w:line="223" w:lineRule="auto"/>
         <w:ind w:left="567" w:hanging="567"/>
         <w:jc w:val="both"/>
       </w:pPr>
@@ -43854,7 +43337,6 @@
         <w:rPr>
           <w:b/>
           <w:bCs/>
-          <w:color w:val="282360"/>
           <w:rtl/>
         </w:rPr>
         <w:t>۳۸-</w:t>
@@ -43863,7 +43345,6 @@
         <w:rPr>
           <w:b/>
           <w:bCs/>
-          <w:color w:val="282360"/>
           <w:rtl/>
         </w:rPr>
         <w:tab/>
@@ -43874,14 +43355,12 @@
       <w:pPr>
         <w:keepNext/>
         <w:keepLines/>
-        <w:shd w:val="clear" w:color="auto" w:fill="FFF8E7"/>
-        <w:spacing w:line="223" w:lineRule="auto" w:after="65"/>
+        <w:spacing w:line="223" w:lineRule="auto"/>
         <w:ind w:left="837" w:hanging="270"/>
         <w:jc w:val="both"/>
       </w:pPr>
       <w:r>
         <w:rPr>
-          <w:color w:val="282360"/>
           <w:sz w:val="26"/>
           <w:szCs w:val="26"/>
           <w:rtl/>
@@ -43890,7 +43369,6 @@
       </w:r>
       <w:r>
         <w:rPr>
-          <w:color w:val="282360"/>
           <w:sz w:val="26"/>
           <w:szCs w:val="26"/>
           <w:rtl/>
@@ -43903,14 +43381,12 @@
       <w:pPr>
         <w:keepNext/>
         <w:keepLines/>
-        <w:shd w:val="clear" w:color="auto" w:fill="FFF8E7"/>
-        <w:spacing w:line="223" w:lineRule="auto" w:after="65"/>
+        <w:spacing w:line="223" w:lineRule="auto"/>
         <w:ind w:left="837" w:hanging="270"/>
         <w:jc w:val="both"/>
       </w:pPr>
       <w:r>
         <w:rPr>
-          <w:color w:val="282360"/>
           <w:sz w:val="26"/>
           <w:szCs w:val="26"/>
           <w:rtl/>
@@ -43919,7 +43395,6 @@
       </w:r>
       <w:r>
         <w:rPr>
-          <w:color w:val="282360"/>
           <w:sz w:val="26"/>
           <w:szCs w:val="26"/>
           <w:rtl/>
@@ -43932,14 +43407,12 @@
       <w:pPr>
         <w:keepNext/>
         <w:keepLines/>
-        <w:shd w:val="clear" w:color="auto" w:fill="FFF8E7"/>
-        <w:spacing w:line="223" w:lineRule="auto" w:after="65"/>
+        <w:spacing w:line="223" w:lineRule="auto"/>
         <w:ind w:left="837" w:hanging="270"/>
         <w:jc w:val="both"/>
       </w:pPr>
       <w:r>
         <w:rPr>
-          <w:color w:val="282360"/>
           <w:sz w:val="26"/>
           <w:szCs w:val="26"/>
           <w:rtl/>
@@ -43948,7 +43421,6 @@
       </w:r>
       <w:r>
         <w:rPr>
-          <w:color w:val="282360"/>
           <w:sz w:val="26"/>
           <w:szCs w:val="26"/>
           <w:rtl/>
@@ -43959,10 +43431,8 @@
     </w:p>
     <w:p>
       <w:pPr>
-        <w:keepNext/>
         <w:keepLines/>
-        <w:shd w:val="clear" w:color="auto" w:fill="FFF8E7"/>
-        <w:spacing w:line="223" w:lineRule="auto" w:after="65"/>
+        <w:spacing w:line="223" w:lineRule="auto"/>
         <w:ind w:left="837" w:hanging="270"/>
         <w:jc w:val="both"/>
         <w:rPr>
@@ -43971,7 +43441,6 @@
       </w:pPr>
       <w:r>
         <w:rPr>
-          <w:color w:val="282360"/>
           <w:sz w:val="26"/>
           <w:szCs w:val="26"/>
           <w:rtl/>
@@ -43980,7 +43449,6 @@
       </w:r>
       <w:r>
         <w:rPr>
-          <w:color w:val="282360"/>
           <w:sz w:val="26"/>
           <w:szCs w:val="26"/>
           <w:rtl/>
@@ -45854,13 +45322,8 @@
       <w:pPr>
         <w:keepNext/>
         <w:keepLines/>
-        <w:pBdr>
-          <w:top w:val="single" w:sz="7" w:space="8" w:color="F0C45F"/>
-          <w:right w:val="single" w:sz="7" w:space="8" w:color="F0C45F"/>
-          <w:left w:val="single" w:sz="7" w:space="8" w:color="F0C45F"/>
-        </w:pBdr>
-        <w:shd w:val="clear" w:color="auto" w:fill="FFF8E7"/>
-        <w:spacing w:line="280" w:lineRule="auto" w:before="80" w:after="80"/>
+        <w:pageBreakBefore/>
+        <w:spacing w:line="223" w:lineRule="auto"/>
         <w:ind w:left="567" w:hanging="567"/>
         <w:jc w:val="both"/>
       </w:pPr>
@@ -45868,7 +45331,6 @@
         <w:rPr>
           <w:b/>
           <w:bCs/>
-          <w:color w:val="282360"/>
           <w:rtl/>
         </w:rPr>
         <w:t>۳۹-</w:t>
@@ -45877,7 +45339,6 @@
         <w:rPr>
           <w:b/>
           <w:bCs/>
-          <w:color w:val="282360"/>
           <w:rtl/>
         </w:rPr>
         <w:tab/>
@@ -45888,14 +45349,12 @@
       <w:pPr>
         <w:keepNext/>
         <w:keepLines/>
-        <w:shd w:val="clear" w:color="auto" w:fill="FFF8E7"/>
-        <w:spacing w:line="223" w:lineRule="auto" w:after="65"/>
+        <w:spacing w:line="223" w:lineRule="auto"/>
         <w:ind w:left="837" w:hanging="270"/>
         <w:jc w:val="both"/>
       </w:pPr>
       <w:r>
         <w:rPr>
-          <w:color w:val="282360"/>
           <w:sz w:val="26"/>
           <w:szCs w:val="26"/>
           <w:rtl/>
@@ -45904,7 +45363,6 @@
       </w:r>
       <w:r>
         <w:rPr>
-          <w:color w:val="282360"/>
           <w:sz w:val="26"/>
           <w:szCs w:val="26"/>
           <w:rtl/>
@@ -45917,14 +45375,12 @@
       <w:pPr>
         <w:keepNext/>
         <w:keepLines/>
-        <w:shd w:val="clear" w:color="auto" w:fill="FFF8E7"/>
-        <w:spacing w:line="223" w:lineRule="auto" w:after="65"/>
+        <w:spacing w:line="223" w:lineRule="auto"/>
         <w:ind w:left="837" w:hanging="270"/>
         <w:jc w:val="both"/>
       </w:pPr>
       <w:r>
         <w:rPr>
-          <w:color w:val="282360"/>
           <w:sz w:val="26"/>
           <w:szCs w:val="26"/>
           <w:rtl/>
@@ -45933,7 +45389,6 @@
       </w:r>
       <w:r>
         <w:rPr>
-          <w:color w:val="282360"/>
           <w:sz w:val="26"/>
           <w:szCs w:val="26"/>
           <w:rtl/>
@@ -45946,14 +45401,12 @@
       <w:pPr>
         <w:keepNext/>
         <w:keepLines/>
-        <w:shd w:val="clear" w:color="auto" w:fill="FFF8E7"/>
-        <w:spacing w:line="223" w:lineRule="auto" w:after="65"/>
+        <w:spacing w:line="223" w:lineRule="auto"/>
         <w:ind w:left="837" w:hanging="270"/>
         <w:jc w:val="both"/>
       </w:pPr>
       <w:r>
         <w:rPr>
-          <w:color w:val="282360"/>
           <w:sz w:val="26"/>
           <w:szCs w:val="26"/>
           <w:rtl/>
@@ -45962,7 +45415,6 @@
       </w:r>
       <w:r>
         <w:rPr>
-          <w:color w:val="282360"/>
           <w:sz w:val="26"/>
           <w:szCs w:val="26"/>
           <w:rtl/>
@@ -45973,10 +45425,8 @@
     </w:p>
     <w:p>
       <w:pPr>
-        <w:keepNext/>
         <w:keepLines/>
-        <w:shd w:val="clear" w:color="auto" w:fill="FFF8E7"/>
-        <w:spacing w:line="223" w:lineRule="auto" w:after="65"/>
+        <w:spacing w:line="223" w:lineRule="auto"/>
         <w:ind w:left="837" w:hanging="270"/>
         <w:jc w:val="both"/>
         <w:rPr>
@@ -45985,7 +45435,6 @@
       </w:pPr>
       <w:r>
         <w:rPr>
-          <w:color w:val="282360"/>
           <w:sz w:val="26"/>
           <w:szCs w:val="26"/>
           <w:rtl/>
@@ -45994,7 +45443,6 @@
       </w:r>
       <w:r>
         <w:rPr>
-          <w:color w:val="282360"/>
           <w:sz w:val="26"/>
           <w:szCs w:val="26"/>
           <w:rtl/>
@@ -47728,13 +47176,8 @@
       <w:pPr>
         <w:keepNext/>
         <w:keepLines/>
-        <w:pBdr>
-          <w:top w:val="single" w:sz="7" w:space="8" w:color="F0C45F"/>
-          <w:right w:val="single" w:sz="7" w:space="8" w:color="F0C45F"/>
-          <w:left w:val="single" w:sz="7" w:space="8" w:color="F0C45F"/>
-        </w:pBdr>
-        <w:shd w:val="clear" w:color="auto" w:fill="FFF8E7"/>
-        <w:spacing w:line="280" w:lineRule="auto" w:before="80" w:after="80"/>
+        <w:pageBreakBefore/>
+        <w:spacing w:line="223" w:lineRule="auto"/>
         <w:ind w:left="567" w:hanging="567"/>
         <w:jc w:val="both"/>
       </w:pPr>
@@ -47742,7 +47185,6 @@
         <w:rPr>
           <w:b/>
           <w:bCs/>
-          <w:color w:val="282360"/>
           <w:rtl/>
         </w:rPr>
         <w:lastRenderedPageBreak/>
@@ -47752,7 +47194,6 @@
         <w:rPr>
           <w:b/>
           <w:bCs/>
-          <w:color w:val="282360"/>
           <w:rtl/>
         </w:rPr>
         <w:tab/>
@@ -47763,14 +47204,12 @@
       <w:pPr>
         <w:keepNext/>
         <w:keepLines/>
-        <w:shd w:val="clear" w:color="auto" w:fill="FFF8E7"/>
-        <w:spacing w:line="223" w:lineRule="auto" w:after="65"/>
+        <w:spacing w:line="223" w:lineRule="auto"/>
         <w:ind w:left="837" w:hanging="270"/>
         <w:jc w:val="both"/>
       </w:pPr>
       <w:r>
         <w:rPr>
-          <w:color w:val="282360"/>
           <w:sz w:val="26"/>
           <w:szCs w:val="26"/>
           <w:rtl/>
@@ -47779,7 +47218,6 @@
       </w:r>
       <w:r>
         <w:rPr>
-          <w:color w:val="282360"/>
           <w:sz w:val="26"/>
           <w:szCs w:val="26"/>
           <w:rtl/>
@@ -47792,14 +47230,12 @@
       <w:pPr>
         <w:keepNext/>
         <w:keepLines/>
-        <w:shd w:val="clear" w:color="auto" w:fill="FFF8E7"/>
-        <w:spacing w:line="223" w:lineRule="auto" w:after="65"/>
+        <w:spacing w:line="223" w:lineRule="auto"/>
         <w:ind w:left="837" w:hanging="270"/>
         <w:jc w:val="both"/>
       </w:pPr>
       <w:r>
         <w:rPr>
-          <w:color w:val="282360"/>
           <w:sz w:val="26"/>
           <w:szCs w:val="26"/>
           <w:rtl/>
@@ -47808,7 +47244,6 @@
       </w:r>
       <w:r>
         <w:rPr>
-          <w:color w:val="282360"/>
           <w:sz w:val="26"/>
           <w:szCs w:val="26"/>
           <w:rtl/>
@@ -47821,14 +47256,12 @@
       <w:pPr>
         <w:keepNext/>
         <w:keepLines/>
-        <w:shd w:val="clear" w:color="auto" w:fill="FFF8E7"/>
-        <w:spacing w:line="223" w:lineRule="auto" w:after="65"/>
+        <w:spacing w:line="223" w:lineRule="auto"/>
         <w:ind w:left="837" w:hanging="270"/>
         <w:jc w:val="both"/>
       </w:pPr>
       <w:r>
         <w:rPr>
-          <w:color w:val="282360"/>
           <w:sz w:val="26"/>
           <w:szCs w:val="26"/>
           <w:rtl/>
@@ -47837,7 +47270,6 @@
       </w:r>
       <w:r>
         <w:rPr>
-          <w:color w:val="282360"/>
           <w:sz w:val="26"/>
           <w:szCs w:val="26"/>
           <w:rtl/>
@@ -47848,10 +47280,8 @@
     </w:p>
     <w:p>
       <w:pPr>
-        <w:keepNext/>
         <w:keepLines/>
-        <w:shd w:val="clear" w:color="auto" w:fill="FFF8E7"/>
-        <w:spacing w:line="223" w:lineRule="auto" w:after="65"/>
+        <w:spacing w:line="223" w:lineRule="auto"/>
         <w:ind w:left="837" w:hanging="270"/>
         <w:jc w:val="both"/>
         <w:rPr>
@@ -47860,7 +47290,6 @@
       </w:pPr>
       <w:r>
         <w:rPr>
-          <w:color w:val="282360"/>
           <w:sz w:val="26"/>
           <w:szCs w:val="26"/>
           <w:rtl/>
@@ -47869,7 +47298,6 @@
       </w:r>
       <w:r>
         <w:rPr>
-          <w:color w:val="282360"/>
           <w:sz w:val="26"/>
           <w:szCs w:val="26"/>
           <w:rtl/>
@@ -50001,13 +49429,8 @@
       <w:pPr>
         <w:keepNext/>
         <w:keepLines/>
-        <w:pBdr>
-          <w:top w:val="single" w:sz="7" w:space="8" w:color="F0C45F"/>
-          <w:right w:val="single" w:sz="7" w:space="8" w:color="F0C45F"/>
-          <w:left w:val="single" w:sz="7" w:space="8" w:color="F0C45F"/>
-        </w:pBdr>
-        <w:shd w:val="clear" w:color="auto" w:fill="FFF8E7"/>
-        <w:spacing w:line="280" w:lineRule="auto" w:before="80" w:after="80"/>
+        <w:pageBreakBefore/>
+        <w:spacing w:line="223" w:lineRule="auto"/>
         <w:ind w:left="567" w:hanging="567"/>
         <w:jc w:val="both"/>
       </w:pPr>
@@ -50015,7 +49438,6 @@
         <w:rPr>
           <w:b/>
           <w:bCs/>
-          <w:color w:val="282360"/>
           <w:rtl/>
         </w:rPr>
         <w:lastRenderedPageBreak/>
@@ -50025,7 +49447,6 @@
         <w:rPr>
           <w:b/>
           <w:bCs/>
-          <w:color w:val="282360"/>
           <w:rtl/>
         </w:rPr>
         <w:tab/>
@@ -50036,7 +49457,6 @@
           <w:rFonts w:hint="cs"/>
           <w:b/>
           <w:bCs/>
-          <w:color w:val="282360"/>
           <w:u w:val="single"/>
           <w:rtl/>
         </w:rPr>
@@ -50046,7 +49466,6 @@
         <w:rPr>
           <w:b/>
           <w:bCs/>
-          <w:color w:val="282360"/>
           <w:rtl/>
         </w:rPr>
         <w:t xml:space="preserve"> است؟</w:t>
@@ -50057,19 +49476,17 @@
         <w:bidiVisual/>
         <w:tblW w:w="9772" w:type="dxa"/>
         <w:tblBorders>
-          <w:top w:val="single" w:sz="4" w:space="0" w:color="F0C45F"/>
-          <w:left w:val="single" w:sz="4" w:space="0" w:color="F0C45F"/>
-          <w:bottom w:val="single" w:sz="4" w:space="0" w:color="F0C45F"/>
-          <w:right w:val="single" w:sz="4" w:space="0" w:color="F0C45F"/>
-          <w:insideH w:val="single" w:sz="4" w:space="0" w:color="F0C45F"/>
-          <w:insideV w:val="single" w:sz="4" w:space="0" w:color="F0C45F"/>
+          <w:top w:val="nil"/>
+          <w:left w:val="nil"/>
+          <w:bottom w:val="nil"/>
+          <w:right w:val="nil"/>
+          <w:insideH w:val="nil"/>
+          <w:insideV w:val="nil"/>
         </w:tblBorders>
         <w:tblLayout w:type="fixed"/>
         <w:tblCellMar>
-          <w:top w:w="85" w:type="dxa"/>
-          <w:left w:w="100" w:type="dxa"/>
-          <w:bottom w:w="85" w:type="dxa"/>
-          <w:right w:w="100" w:type="dxa"/>
+          <w:left w:w="0" w:type="dxa"/>
+          <w:right w:w="0" w:type="dxa"/>
         </w:tblCellMar>
         <w:tblLook w:val="04A0" w:firstRow="1" w:lastRow="0" w:firstColumn="1" w:lastColumn="0" w:noHBand="0" w:noVBand="1"/>
       </w:tblPr>
@@ -50084,8 +49501,6 @@
         <w:tc>
           <w:tcPr>
             <w:tcW w:w="7652" w:type="dxa"/>
-            <w:shd w:val="clear" w:color="auto" w:fill="FFF8E7"/>
-            <w:vAlign w:val="center"/>
           </w:tcPr>
           <w:p>
             <w:pPr>
@@ -50097,7 +49512,6 @@
             </w:pPr>
             <w:r>
               <w:rPr>
-                <w:color w:val="282360"/>
                 <w:sz w:val="26"/>
                 <w:szCs w:val="26"/>
                 <w:rtl/>
@@ -50106,7 +49520,6 @@
             </w:r>
             <w:r>
               <w:rPr>
-                <w:color w:val="282360"/>
                 <w:sz w:val="26"/>
                 <w:szCs w:val="26"/>
                 <w:rtl/>
@@ -50117,7 +49530,6 @@
             <w:r>
               <w:rPr>
                 <w:rFonts w:hint="cs"/>
-                <w:color w:val="282360"/>
                 <w:sz w:val="26"/>
                 <w:szCs w:val="26"/>
                 <w:rtl/>
@@ -50126,7 +49538,6 @@
             </w:r>
             <w:r>
               <w:rPr>
-                <w:color w:val="282360"/>
                 <w:sz w:val="26"/>
                 <w:szCs w:val="26"/>
                 <w:rtl/>
@@ -50144,7 +49555,6 @@
             </w:pPr>
             <w:r>
               <w:rPr>
-                <w:color w:val="282360"/>
                 <w:sz w:val="26"/>
                 <w:szCs w:val="26"/>
                 <w:rtl/>
@@ -50153,7 +49563,6 @@
             </w:r>
             <w:r>
               <w:rPr>
-                <w:color w:val="282360"/>
                 <w:sz w:val="26"/>
                 <w:szCs w:val="26"/>
                 <w:rtl/>
@@ -50164,7 +49573,6 @@
             <w:r>
               <w:rPr>
                 <w:rFonts w:hint="cs"/>
-                <w:color w:val="282360"/>
                 <w:sz w:val="26"/>
                 <w:szCs w:val="26"/>
                 <w:rtl/>
@@ -50173,7 +49581,6 @@
             </w:r>
             <w:r>
               <w:rPr>
-                <w:color w:val="282360"/>
                 <w:sz w:val="26"/>
                 <w:szCs w:val="26"/>
                 <w:rtl/>
@@ -50191,7 +49598,6 @@
             </w:pPr>
             <w:r>
               <w:rPr>
-                <w:color w:val="282360"/>
                 <w:sz w:val="26"/>
                 <w:szCs w:val="26"/>
                 <w:rtl/>
@@ -50200,7 +49606,6 @@
             </w:r>
             <w:r>
               <w:rPr>
-                <w:color w:val="282360"/>
                 <w:sz w:val="26"/>
                 <w:szCs w:val="26"/>
                 <w:rtl/>
@@ -50224,7 +49629,6 @@
             </w:pPr>
             <w:r>
               <w:rPr>
-                <w:color w:val="282360"/>
                 <w:sz w:val="26"/>
                 <w:szCs w:val="26"/>
                 <w:rtl/>
@@ -50233,7 +49637,6 @@
             </w:r>
             <w:r>
               <w:rPr>
-                <w:color w:val="282360"/>
                 <w:sz w:val="26"/>
                 <w:szCs w:val="26"/>
                 <w:rtl/>
@@ -50246,8 +49649,6 @@
         <w:tc>
           <w:tcPr>
             <w:tcW w:w="2120" w:type="dxa"/>
-            <w:shd w:val="clear" w:color="auto" w:fill="FFF8E7"/>
-            <w:vAlign w:val="center"/>
           </w:tcPr>
           <w:p>
             <w:pPr>
@@ -50259,7 +49660,6 @@
             <w:r>
               <w:rPr>
                 <w:noProof/>
-                <w:color w:val="282360"/>
               </w:rPr>
               <w:drawing>
                 <wp:inline distT="0" distB="0" distL="0" distR="0" wp14:anchorId="53143DE5" wp14:editId="4A975DFF">
@@ -52670,13 +52070,8 @@
       <w:pPr>
         <w:keepNext/>
         <w:keepLines/>
-        <w:pBdr>
-          <w:top w:val="single" w:sz="7" w:space="8" w:color="F0C45F"/>
-          <w:right w:val="single" w:sz="7" w:space="8" w:color="F0C45F"/>
-          <w:left w:val="single" w:sz="7" w:space="8" w:color="F0C45F"/>
-        </w:pBdr>
-        <w:shd w:val="clear" w:color="auto" w:fill="FFF8E7"/>
-        <w:spacing w:line="280" w:lineRule="auto" w:before="80" w:after="80"/>
+        <w:pageBreakBefore/>
+        <w:spacing w:line="223" w:lineRule="auto"/>
         <w:ind w:left="567" w:hanging="567"/>
         <w:jc w:val="both"/>
       </w:pPr>
@@ -52684,7 +52079,6 @@
         <w:rPr>
           <w:b/>
           <w:bCs/>
-          <w:color w:val="282360"/>
           <w:rtl/>
         </w:rPr>
         <w:t>۴۲-</w:t>
@@ -52693,7 +52087,6 @@
         <w:rPr>
           <w:b/>
           <w:bCs/>
-          <w:color w:val="282360"/>
           <w:rtl/>
         </w:rPr>
         <w:tab/>
@@ -52704,14 +52097,12 @@
       <w:pPr>
         <w:keepNext/>
         <w:keepLines/>
-        <w:shd w:val="clear" w:color="auto" w:fill="FFF8E7"/>
-        <w:spacing w:line="223" w:lineRule="auto" w:after="65"/>
+        <w:spacing w:line="223" w:lineRule="auto"/>
         <w:ind w:left="837" w:hanging="270"/>
         <w:jc w:val="both"/>
       </w:pPr>
       <w:r>
         <w:rPr>
-          <w:color w:val="282360"/>
           <w:sz w:val="26"/>
           <w:szCs w:val="26"/>
           <w:rtl/>
@@ -52720,7 +52111,6 @@
       </w:r>
       <w:r>
         <w:rPr>
-          <w:color w:val="282360"/>
           <w:sz w:val="26"/>
           <w:szCs w:val="26"/>
           <w:rtl/>
@@ -52730,7 +52120,6 @@
       <w:r>
         <w:rPr>
           <w:rFonts w:hint="cs"/>
-          <w:color w:val="282360"/>
           <w:sz w:val="26"/>
           <w:szCs w:val="26"/>
           <w:rtl/>
@@ -52739,7 +52128,6 @@
       </w:r>
       <w:r>
         <w:rPr>
-          <w:color w:val="282360"/>
           <w:sz w:val="26"/>
           <w:szCs w:val="26"/>
           <w:rtl/>
@@ -52751,14 +52139,12 @@
       <w:pPr>
         <w:keepNext/>
         <w:keepLines/>
-        <w:shd w:val="clear" w:color="auto" w:fill="FFF8E7"/>
-        <w:spacing w:line="223" w:lineRule="auto" w:after="65"/>
+        <w:spacing w:line="223" w:lineRule="auto"/>
         <w:ind w:left="837" w:hanging="270"/>
         <w:jc w:val="both"/>
       </w:pPr>
       <w:r>
         <w:rPr>
-          <w:color w:val="282360"/>
           <w:sz w:val="26"/>
           <w:szCs w:val="26"/>
           <w:rtl/>
@@ -52767,7 +52153,6 @@
       </w:r>
       <w:r>
         <w:rPr>
-          <w:color w:val="282360"/>
           <w:sz w:val="26"/>
           <w:szCs w:val="26"/>
           <w:rtl/>
@@ -52778,7 +52163,6 @@
       <w:r>
         <w:rPr>
           <w:rFonts w:hint="cs"/>
-          <w:color w:val="282360"/>
           <w:sz w:val="26"/>
           <w:szCs w:val="26"/>
           <w:rtl/>
@@ -52787,7 +52171,6 @@
       </w:r>
       <w:r>
         <w:rPr>
-          <w:color w:val="282360"/>
           <w:sz w:val="26"/>
           <w:szCs w:val="26"/>
           <w:rtl/>
@@ -52799,14 +52182,12 @@
       <w:pPr>
         <w:keepNext/>
         <w:keepLines/>
-        <w:shd w:val="clear" w:color="auto" w:fill="FFF8E7"/>
-        <w:spacing w:line="223" w:lineRule="auto" w:after="65"/>
+        <w:spacing w:line="223" w:lineRule="auto"/>
         <w:ind w:left="837" w:hanging="270"/>
         <w:jc w:val="both"/>
       </w:pPr>
       <w:r>
         <w:rPr>
-          <w:color w:val="282360"/>
           <w:sz w:val="26"/>
           <w:szCs w:val="26"/>
           <w:rtl/>
@@ -52815,7 +52196,6 @@
       </w:r>
       <w:r>
         <w:rPr>
-          <w:color w:val="282360"/>
           <w:sz w:val="26"/>
           <w:szCs w:val="26"/>
           <w:rtl/>
@@ -52826,10 +52206,8 @@
     </w:p>
     <w:p>
       <w:pPr>
-        <w:keepNext/>
         <w:keepLines/>
-        <w:shd w:val="clear" w:color="auto" w:fill="FFF8E7"/>
-        <w:spacing w:line="223" w:lineRule="auto" w:after="65"/>
+        <w:spacing w:line="223" w:lineRule="auto"/>
         <w:ind w:left="837" w:hanging="270"/>
         <w:jc w:val="both"/>
         <w:rPr>
@@ -52838,7 +52216,6 @@
       </w:pPr>
       <w:r>
         <w:rPr>
-          <w:color w:val="282360"/>
           <w:sz w:val="26"/>
           <w:szCs w:val="26"/>
           <w:rtl/>
@@ -52847,7 +52224,6 @@
       </w:r>
       <w:r>
         <w:rPr>
-          <w:color w:val="282360"/>
           <w:sz w:val="26"/>
           <w:szCs w:val="26"/>
           <w:rtl/>
@@ -54495,13 +53871,8 @@
       <w:pPr>
         <w:keepNext/>
         <w:keepLines/>
-        <w:pBdr>
-          <w:top w:val="single" w:sz="7" w:space="8" w:color="F0C45F"/>
-          <w:right w:val="single" w:sz="7" w:space="8" w:color="F0C45F"/>
-          <w:left w:val="single" w:sz="7" w:space="8" w:color="F0C45F"/>
-        </w:pBdr>
-        <w:shd w:val="clear" w:color="auto" w:fill="FFF8E7"/>
-        <w:spacing w:line="280" w:lineRule="auto" w:before="80" w:after="80"/>
+        <w:pageBreakBefore/>
+        <w:spacing w:line="223" w:lineRule="auto"/>
         <w:ind w:left="567" w:hanging="567"/>
         <w:jc w:val="both"/>
       </w:pPr>
@@ -54509,7 +53880,6 @@
         <w:rPr>
           <w:b/>
           <w:bCs/>
-          <w:color w:val="282360"/>
           <w:rtl/>
         </w:rPr>
         <w:t>۴۳-</w:t>
@@ -54518,7 +53888,6 @@
         <w:rPr>
           <w:b/>
           <w:bCs/>
-          <w:color w:val="282360"/>
           <w:rtl/>
         </w:rPr>
         <w:tab/>
@@ -54529,8 +53898,7 @@
       <w:pPr>
         <w:keepNext/>
         <w:keepLines/>
-        <w:shd w:val="clear" w:color="auto" w:fill="FFF8E7"/>
-        <w:spacing w:line="223" w:lineRule="auto" w:after="65"/>
+        <w:spacing w:line="223" w:lineRule="auto"/>
         <w:ind w:left="567"/>
         <w:jc w:val="both"/>
         <w:rPr>
@@ -54541,7 +53909,6 @@
         <w:rPr>
           <w:b/>
           <w:bCs/>
-          <w:color w:val="282360"/>
           <w:rtl/>
         </w:rPr>
         <w:t>الف: متخلخل بودن پوشش دولایهٔ هستهٔ</w:t>
@@ -54551,7 +53918,6 @@
           <w:rFonts w:hint="cs"/>
           <w:b/>
           <w:bCs/>
-          <w:color w:val="282360"/>
           <w:rtl/>
         </w:rPr>
         <w:t xml:space="preserve"> قاعده‌ای</w:t>
@@ -54561,8 +53927,7 @@
       <w:pPr>
         <w:keepNext/>
         <w:keepLines/>
-        <w:shd w:val="clear" w:color="auto" w:fill="FFF8E7"/>
-        <w:spacing w:line="223" w:lineRule="auto" w:after="65"/>
+        <w:spacing w:line="223" w:lineRule="auto"/>
         <w:ind w:left="567"/>
         <w:jc w:val="both"/>
       </w:pPr>
@@ -54570,7 +53935,6 @@
         <w:rPr>
           <w:b/>
           <w:bCs/>
-          <w:color w:val="282360"/>
           <w:rtl/>
         </w:rPr>
         <w:t>ب: داشتن سطح قاعده‌ایِ گسترده‌تر از سطح رأسی</w:t>
@@ -54580,8 +53944,7 @@
       <w:pPr>
         <w:keepNext/>
         <w:keepLines/>
-        <w:shd w:val="clear" w:color="auto" w:fill="FFF8E7"/>
-        <w:spacing w:line="223" w:lineRule="auto" w:after="65"/>
+        <w:spacing w:line="223" w:lineRule="auto"/>
         <w:ind w:left="567"/>
         <w:jc w:val="both"/>
       </w:pPr>
@@ -54589,7 +53952,6 @@
         <w:rPr>
           <w:b/>
           <w:bCs/>
-          <w:color w:val="282360"/>
           <w:rtl/>
         </w:rPr>
         <w:t>ج: توانایی ایجاد فرورفتگی و برآمدگی در غشای خود</w:t>
@@ -54599,8 +53961,7 @@
       <w:pPr>
         <w:keepNext/>
         <w:keepLines/>
-        <w:shd w:val="clear" w:color="auto" w:fill="FFF8E7"/>
-        <w:spacing w:line="223" w:lineRule="auto" w:after="65"/>
+        <w:spacing w:line="223" w:lineRule="auto"/>
         <w:ind w:left="567"/>
         <w:jc w:val="both"/>
       </w:pPr>
@@ -54608,7 +53969,6 @@
         <w:rPr>
           <w:b/>
           <w:bCs/>
-          <w:color w:val="282360"/>
           <w:rtl/>
         </w:rPr>
         <w:t>د: سازمان یافتن روی شبکه‌ای از رشته‌های گلیکوپروتئینی</w:t>
@@ -54619,19 +53979,17 @@
         <w:bidiVisual/>
         <w:tblW w:w="9772" w:type="dxa"/>
         <w:tblBorders>
-          <w:top w:val="single" w:sz="4" w:space="0" w:color="F0C45F"/>
-          <w:left w:val="single" w:sz="4" w:space="0" w:color="F0C45F"/>
-          <w:bottom w:val="single" w:sz="4" w:space="0" w:color="F0C45F"/>
-          <w:right w:val="single" w:sz="4" w:space="0" w:color="F0C45F"/>
-          <w:insideH w:val="single" w:sz="4" w:space="0" w:color="F0C45F"/>
-          <w:insideV w:val="single" w:sz="4" w:space="0" w:color="F0C45F"/>
+          <w:top w:val="nil"/>
+          <w:left w:val="nil"/>
+          <w:bottom w:val="nil"/>
+          <w:right w:val="nil"/>
+          <w:insideH w:val="nil"/>
+          <w:insideV w:val="nil"/>
         </w:tblBorders>
         <w:tblLayout w:type="fixed"/>
         <w:tblCellMar>
-          <w:top w:w="85" w:type="dxa"/>
-          <w:left w:w="100" w:type="dxa"/>
-          <w:bottom w:w="85" w:type="dxa"/>
-          <w:right w:w="100" w:type="dxa"/>
+          <w:left w:w="0" w:type="dxa"/>
+          <w:right w:w="0" w:type="dxa"/>
         </w:tblCellMar>
         <w:tblLook w:val="04A0" w:firstRow="1" w:lastRow="0" w:firstColumn="1" w:lastColumn="0" w:noHBand="0" w:noVBand="1"/>
       </w:tblPr>
@@ -54648,8 +54006,6 @@
         <w:tc>
           <w:tcPr>
             <w:tcW w:w="2868" w:type="dxa"/>
-            <w:shd w:val="clear" w:color="auto" w:fill="FFF8E7"/>
-            <w:vAlign w:val="center"/>
           </w:tcPr>
           <w:p>
             <w:pPr>
@@ -54659,7 +54015,6 @@
             </w:pPr>
             <w:r>
               <w:rPr>
-                <w:color w:val="282360"/>
                 <w:sz w:val="26"/>
                 <w:szCs w:val="26"/>
                 <w:rtl/>
@@ -54671,8 +54026,6 @@
         <w:tc>
           <w:tcPr>
             <w:tcW w:w="2301" w:type="dxa"/>
-            <w:shd w:val="clear" w:color="auto" w:fill="FFF8E7"/>
-            <w:vAlign w:val="center"/>
           </w:tcPr>
           <w:p>
             <w:pPr>
@@ -54681,7 +54034,6 @@
             </w:pPr>
             <w:r>
               <w:rPr>
-                <w:color w:val="282360"/>
                 <w:sz w:val="26"/>
                 <w:szCs w:val="26"/>
                 <w:rtl/>
@@ -54693,8 +54045,6 @@
         <w:tc>
           <w:tcPr>
             <w:tcW w:w="2301" w:type="dxa"/>
-            <w:shd w:val="clear" w:color="auto" w:fill="FFF8E7"/>
-            <w:vAlign w:val="center"/>
           </w:tcPr>
           <w:p>
             <w:pPr>
@@ -54703,7 +54053,6 @@
             </w:pPr>
             <w:r>
               <w:rPr>
-                <w:color w:val="282360"/>
                 <w:sz w:val="26"/>
                 <w:szCs w:val="26"/>
                 <w:rtl/>
@@ -54715,8 +54064,6 @@
         <w:tc>
           <w:tcPr>
             <w:tcW w:w="2302" w:type="dxa"/>
-            <w:shd w:val="clear" w:color="auto" w:fill="FFF8E7"/>
-            <w:vAlign w:val="center"/>
           </w:tcPr>
           <w:p>
             <w:pPr>
@@ -54728,7 +54075,6 @@
             </w:pPr>
             <w:r>
               <w:rPr>
-                <w:color w:val="282360"/>
                 <w:sz w:val="26"/>
                 <w:szCs w:val="26"/>
                 <w:rtl/>
@@ -56662,13 +56008,8 @@
       <w:pPr>
         <w:keepNext/>
         <w:keepLines/>
-        <w:pBdr>
-          <w:top w:val="single" w:sz="7" w:space="8" w:color="F0C45F"/>
-          <w:right w:val="single" w:sz="7" w:space="8" w:color="F0C45F"/>
-          <w:left w:val="single" w:sz="7" w:space="8" w:color="F0C45F"/>
-        </w:pBdr>
-        <w:shd w:val="clear" w:color="auto" w:fill="FFF8E7"/>
-        <w:spacing w:line="280" w:lineRule="auto" w:before="80" w:after="80"/>
+        <w:pageBreakBefore/>
+        <w:spacing w:line="223" w:lineRule="auto"/>
         <w:ind w:left="567" w:hanging="567"/>
         <w:jc w:val="both"/>
       </w:pPr>
@@ -56676,7 +56017,6 @@
         <w:rPr>
           <w:b/>
           <w:bCs/>
-          <w:color w:val="282360"/>
           <w:rtl/>
         </w:rPr>
         <w:t>۴۴-</w:t>
@@ -56685,7 +56025,6 @@
         <w:rPr>
           <w:b/>
           <w:bCs/>
-          <w:color w:val="282360"/>
           <w:rtl/>
         </w:rPr>
         <w:tab/>
@@ -56696,14 +56035,12 @@
       <w:pPr>
         <w:keepNext/>
         <w:keepLines/>
-        <w:shd w:val="clear" w:color="auto" w:fill="FFF8E7"/>
-        <w:spacing w:line="223" w:lineRule="auto" w:after="65"/>
+        <w:spacing w:line="223" w:lineRule="auto"/>
         <w:ind w:left="837" w:hanging="270"/>
         <w:jc w:val="both"/>
       </w:pPr>
       <w:r>
         <w:rPr>
-          <w:color w:val="282360"/>
           <w:sz w:val="26"/>
           <w:szCs w:val="26"/>
           <w:rtl/>
@@ -56712,7 +56049,6 @@
       </w:r>
       <w:r>
         <w:rPr>
-          <w:color w:val="282360"/>
           <w:sz w:val="26"/>
           <w:szCs w:val="26"/>
           <w:rtl/>
@@ -56725,14 +56061,12 @@
       <w:pPr>
         <w:keepNext/>
         <w:keepLines/>
-        <w:shd w:val="clear" w:color="auto" w:fill="FFF8E7"/>
-        <w:spacing w:line="223" w:lineRule="auto" w:after="65"/>
+        <w:spacing w:line="223" w:lineRule="auto"/>
         <w:ind w:left="837" w:hanging="270"/>
         <w:jc w:val="both"/>
       </w:pPr>
       <w:r>
         <w:rPr>
-          <w:color w:val="282360"/>
           <w:sz w:val="26"/>
           <w:szCs w:val="26"/>
           <w:rtl/>
@@ -56741,7 +56075,6 @@
       </w:r>
       <w:r>
         <w:rPr>
-          <w:color w:val="282360"/>
           <w:sz w:val="26"/>
           <w:szCs w:val="26"/>
           <w:rtl/>
@@ -56754,14 +56087,12 @@
       <w:pPr>
         <w:keepNext/>
         <w:keepLines/>
-        <w:shd w:val="clear" w:color="auto" w:fill="FFF8E7"/>
-        <w:spacing w:line="223" w:lineRule="auto" w:after="65"/>
+        <w:spacing w:line="223" w:lineRule="auto"/>
         <w:ind w:left="837" w:hanging="270"/>
         <w:jc w:val="both"/>
       </w:pPr>
       <w:r>
         <w:rPr>
-          <w:color w:val="282360"/>
           <w:sz w:val="26"/>
           <w:szCs w:val="26"/>
           <w:rtl/>
@@ -56770,7 +56101,6 @@
       </w:r>
       <w:r>
         <w:rPr>
-          <w:color w:val="282360"/>
           <w:sz w:val="26"/>
           <w:szCs w:val="26"/>
           <w:rtl/>
@@ -56781,10 +56111,8 @@
     </w:p>
     <w:p>
       <w:pPr>
-        <w:keepNext/>
         <w:keepLines/>
-        <w:shd w:val="clear" w:color="auto" w:fill="FFF8E7"/>
-        <w:spacing w:line="223" w:lineRule="auto" w:after="65"/>
+        <w:spacing w:line="223" w:lineRule="auto"/>
         <w:ind w:left="837" w:hanging="270"/>
         <w:jc w:val="both"/>
         <w:rPr>
@@ -56793,7 +56121,6 @@
       </w:pPr>
       <w:r>
         <w:rPr>
-          <w:color w:val="282360"/>
           <w:sz w:val="26"/>
           <w:szCs w:val="26"/>
           <w:rtl/>
@@ -56802,7 +56129,6 @@
       </w:r>
       <w:r>
         <w:rPr>
-          <w:color w:val="282360"/>
           <w:sz w:val="26"/>
           <w:szCs w:val="26"/>
           <w:rtl/>
@@ -58835,13 +58161,8 @@
       <w:pPr>
         <w:keepNext/>
         <w:keepLines/>
-        <w:pBdr>
-          <w:top w:val="single" w:sz="7" w:space="8" w:color="F0C45F"/>
-          <w:right w:val="single" w:sz="7" w:space="8" w:color="F0C45F"/>
-          <w:left w:val="single" w:sz="7" w:space="8" w:color="F0C45F"/>
-        </w:pBdr>
-        <w:shd w:val="clear" w:color="auto" w:fill="FFF8E7"/>
-        <w:spacing w:line="280" w:lineRule="auto" w:before="80" w:after="80"/>
+        <w:pageBreakBefore/>
+        <w:spacing w:line="223" w:lineRule="auto"/>
         <w:ind w:left="567" w:hanging="567"/>
         <w:jc w:val="both"/>
       </w:pPr>
@@ -58849,7 +58170,6 @@
         <w:rPr>
           <w:b/>
           <w:bCs/>
-          <w:color w:val="282360"/>
           <w:rtl/>
         </w:rPr>
         <w:t>۴۵-</w:t>
@@ -58858,7 +58178,6 @@
         <w:rPr>
           <w:b/>
           <w:bCs/>
-          <w:color w:val="282360"/>
           <w:rtl/>
         </w:rPr>
         <w:tab/>
@@ -58869,7 +58188,6 @@
           <w:rFonts w:cs="Times New Roman" w:hint="cs"/>
           <w:b/>
           <w:bCs/>
-          <w:color w:val="282360"/>
           <w:rtl/>
         </w:rPr>
         <w:t xml:space="preserve"> </w:t>
@@ -58878,7 +58196,6 @@
         <w:rPr>
           <w:b/>
           <w:bCs/>
-          <w:color w:val="282360"/>
           <w:rtl/>
         </w:rPr>
         <w:t>قبل از ورود به سیاهرگ باب کبدی، در محلی با خون خارج‌شده از قوسِ داخلی معده، به سیاهرگ واحدی می‌ریزد. کدام مورد در ارتباط با این محل، درست است؟</w:t>
@@ -58888,14 +58205,12 @@
       <w:pPr>
         <w:keepNext/>
         <w:keepLines/>
-        <w:shd w:val="clear" w:color="auto" w:fill="FFF8E7"/>
-        <w:spacing w:line="223" w:lineRule="auto" w:after="65"/>
+        <w:spacing w:line="223" w:lineRule="auto"/>
         <w:ind w:left="837" w:hanging="270"/>
         <w:jc w:val="both"/>
       </w:pPr>
       <w:r>
         <w:rPr>
-          <w:color w:val="282360"/>
           <w:sz w:val="26"/>
           <w:szCs w:val="26"/>
           <w:rtl/>
@@ -58904,7 +58219,6 @@
       </w:r>
       <w:r>
         <w:rPr>
-          <w:color w:val="282360"/>
           <w:sz w:val="26"/>
           <w:szCs w:val="26"/>
           <w:rtl/>
@@ -58917,14 +58231,12 @@
       <w:pPr>
         <w:keepNext/>
         <w:keepLines/>
-        <w:shd w:val="clear" w:color="auto" w:fill="FFF8E7"/>
-        <w:spacing w:line="223" w:lineRule="auto" w:after="65"/>
+        <w:spacing w:line="223" w:lineRule="auto"/>
         <w:ind w:left="837" w:hanging="270"/>
         <w:jc w:val="both"/>
       </w:pPr>
       <w:r>
         <w:rPr>
-          <w:color w:val="282360"/>
           <w:sz w:val="26"/>
           <w:szCs w:val="26"/>
           <w:rtl/>
@@ -58933,7 +58245,6 @@
       </w:r>
       <w:r>
         <w:rPr>
-          <w:color w:val="282360"/>
           <w:sz w:val="26"/>
           <w:szCs w:val="26"/>
           <w:rtl/>
@@ -58946,14 +58257,12 @@
       <w:pPr>
         <w:keepNext/>
         <w:keepLines/>
-        <w:shd w:val="clear" w:color="auto" w:fill="FFF8E7"/>
-        <w:spacing w:line="223" w:lineRule="auto" w:after="65"/>
+        <w:spacing w:line="223" w:lineRule="auto"/>
         <w:ind w:left="837" w:hanging="270"/>
         <w:jc w:val="both"/>
       </w:pPr>
       <w:r>
         <w:rPr>
-          <w:color w:val="282360"/>
           <w:sz w:val="26"/>
           <w:szCs w:val="26"/>
           <w:rtl/>
@@ -58962,7 +58271,6 @@
       </w:r>
       <w:r>
         <w:rPr>
-          <w:color w:val="282360"/>
           <w:sz w:val="26"/>
           <w:szCs w:val="26"/>
           <w:rtl/>
@@ -58972,7 +58280,6 @@
       <w:r>
         <w:rPr>
           <w:rFonts w:hint="cs"/>
-          <w:color w:val="282360"/>
           <w:sz w:val="26"/>
           <w:szCs w:val="26"/>
           <w:rtl/>
@@ -58982,16 +58289,13 @@
     </w:p>
     <w:p>
       <w:pPr>
-        <w:keepNext/>
         <w:keepLines/>
-        <w:shd w:val="clear" w:color="auto" w:fill="FFF8E7"/>
-        <w:spacing w:line="223" w:lineRule="auto" w:after="65"/>
+        <w:spacing w:line="223" w:lineRule="auto"/>
         <w:ind w:left="837" w:hanging="270"/>
         <w:jc w:val="both"/>
       </w:pPr>
       <w:r>
         <w:rPr>
-          <w:color w:val="282360"/>
           <w:sz w:val="26"/>
           <w:szCs w:val="26"/>
           <w:rtl/>
@@ -59000,7 +58304,6 @@
       </w:r>
       <w:r>
         <w:rPr>
-          <w:color w:val="282360"/>
           <w:sz w:val="26"/>
           <w:szCs w:val="26"/>
           <w:rtl/>

</xml_diff>